<commit_message>
docs: update project scope document
</commit_message>
<xml_diff>
--- a/DOCX/TaiLieuPhanTich/01_Pham_vi_de_tai.docx
+++ b/DOCX/TaiLieuPhanTich/01_Pham_vi_de_tai.docx
@@ -5,15 +5,36 @@
     <w:p>
       <w:pPr>
         <w:pStyle w:val="Heading1"/>
-        <w:rPr>
-          <w:rFonts w:cs="Times New Roman"/>
-          <w:szCs w:val="26"/>
-        </w:rPr>
-      </w:pPr>
-      <w:r>
-        <w:rPr>
-          <w:rFonts w:cs="Times New Roman"/>
-          <w:szCs w:val="26"/>
+        <w:spacing w:after="120" w:line="360" w:lineRule="auto"/>
+        <w:jc w:val="center"/>
+        <w:rPr>
+          <w:rFonts w:cs="Times New Roman"/>
+          <w:sz w:val="32"/>
+          <w:szCs w:val="32"/>
+        </w:rPr>
+      </w:pPr>
+      <w:r>
+        <w:rPr>
+          <w:rFonts w:cs="Times New Roman"/>
+          <w:sz w:val="32"/>
+          <w:szCs w:val="32"/>
+        </w:rPr>
+        <w:t>I</w:t>
+      </w:r>
+      <w:r>
+        <w:rPr>
+          <w:rFonts w:cs="Times New Roman"/>
+          <w:sz w:val="32"/>
+          <w:szCs w:val="32"/>
+          <w:lang w:val="vi-VN"/>
+        </w:rPr>
+        <w:t xml:space="preserve">. </w:t>
+      </w:r>
+      <w:r>
+        <w:rPr>
+          <w:rFonts w:cs="Times New Roman"/>
+          <w:sz w:val="32"/>
+          <w:szCs w:val="32"/>
         </w:rPr>
         <w:t>PHẠM VI ĐỀ TÀI</w:t>
       </w:r>
@@ -21,9 +42,22 @@
     <w:p>
       <w:pPr>
         <w:pStyle w:val="Heading2"/>
-      </w:pPr>
-      <w:r>
-        <w:t xml:space="preserve">1. Thông tin </w:t>
+        <w:spacing w:after="120" w:line="360" w:lineRule="auto"/>
+      </w:pPr>
+      <w:r>
+        <w:t>1.</w:t>
+      </w:r>
+      <w:r>
+        <w:t>1</w:t>
+      </w:r>
+      <w:r>
+        <w:rPr>
+          <w:lang w:val="vi-VN"/>
+        </w:rPr>
+        <w:t>.</w:t>
+      </w:r>
+      <w:r>
+        <w:t xml:space="preserve"> Thông tin </w:t>
       </w:r>
       <w:proofErr w:type="spellStart"/>
       <w:r>
@@ -45,6 +79,7 @@
           <w:ilvl w:val="0"/>
           <w:numId w:val="1"/>
         </w:numPr>
+        <w:spacing w:after="120" w:line="360" w:lineRule="auto"/>
         <w:rPr>
           <w:rFonts w:cs="Times New Roman"/>
           <w:sz w:val="26"/>
@@ -220,6 +255,7 @@
           <w:ilvl w:val="0"/>
           <w:numId w:val="1"/>
         </w:numPr>
+        <w:spacing w:after="120" w:line="360" w:lineRule="auto"/>
         <w:rPr>
           <w:rFonts w:cs="Times New Roman"/>
           <w:sz w:val="26"/>
@@ -287,6 +323,7 @@
           <w:ilvl w:val="0"/>
           <w:numId w:val="1"/>
         </w:numPr>
+        <w:spacing w:after="120" w:line="360" w:lineRule="auto"/>
         <w:rPr>
           <w:rFonts w:cs="Times New Roman"/>
           <w:sz w:val="26"/>
@@ -354,6 +391,7 @@
           <w:ilvl w:val="0"/>
           <w:numId w:val="1"/>
         </w:numPr>
+        <w:spacing w:after="120" w:line="360" w:lineRule="auto"/>
         <w:rPr>
           <w:rFonts w:cs="Times New Roman"/>
           <w:sz w:val="26"/>
@@ -454,7 +492,17 @@
     <w:p>
       <w:pPr>
         <w:pStyle w:val="Heading2"/>
-      </w:pPr>
+        <w:spacing w:after="120" w:line="360" w:lineRule="auto"/>
+      </w:pPr>
+      <w:r>
+        <w:t>1</w:t>
+      </w:r>
+      <w:r>
+        <w:rPr>
+          <w:lang w:val="vi-VN"/>
+        </w:rPr>
+        <w:t>.</w:t>
+      </w:r>
       <w:r>
         <w:t xml:space="preserve">2. Quy </w:t>
       </w:r>
@@ -498,6 +546,7 @@
     </w:p>
     <w:p>
       <w:pPr>
+        <w:spacing w:after="120" w:line="360" w:lineRule="auto"/>
         <w:rPr>
           <w:rFonts w:cs="Times New Roman"/>
           <w:sz w:val="26"/>
@@ -561,20 +610,18 @@
     </w:p>
     <w:p>
       <w:pPr>
-        <w:rPr>
-          <w:rFonts w:cs="Times New Roman"/>
-          <w:sz w:val="26"/>
-          <w:szCs w:val="26"/>
-        </w:rPr>
-      </w:pPr>
-      <w:r>
-        <w:rPr>
-          <w:rFonts w:cs="Times New Roman"/>
-          <w:sz w:val="26"/>
-          <w:szCs w:val="26"/>
-        </w:rPr>
-        <w:t xml:space="preserve">→ </w:t>
-      </w:r>
+        <w:pStyle w:val="ListParagraph"/>
+        <w:numPr>
+          <w:ilvl w:val="0"/>
+          <w:numId w:val="8"/>
+        </w:numPr>
+        <w:spacing w:after="120" w:line="360" w:lineRule="auto"/>
+        <w:rPr>
+          <w:rFonts w:cs="Times New Roman"/>
+          <w:sz w:val="26"/>
+          <w:szCs w:val="26"/>
+        </w:rPr>
+      </w:pPr>
       <w:proofErr w:type="spellStart"/>
       <w:r>
         <w:rPr>
@@ -696,20 +743,18 @@
     </w:p>
     <w:p>
       <w:pPr>
-        <w:rPr>
-          <w:rFonts w:cs="Times New Roman"/>
-          <w:sz w:val="26"/>
-          <w:szCs w:val="26"/>
-        </w:rPr>
-      </w:pPr>
-      <w:r>
-        <w:rPr>
-          <w:rFonts w:cs="Times New Roman"/>
-          <w:sz w:val="26"/>
-          <w:szCs w:val="26"/>
-        </w:rPr>
-        <w:t xml:space="preserve">→ </w:t>
-      </w:r>
+        <w:pStyle w:val="ListParagraph"/>
+        <w:numPr>
+          <w:ilvl w:val="0"/>
+          <w:numId w:val="8"/>
+        </w:numPr>
+        <w:spacing w:after="120" w:line="360" w:lineRule="auto"/>
+        <w:rPr>
+          <w:rFonts w:cs="Times New Roman"/>
+          <w:sz w:val="26"/>
+          <w:szCs w:val="26"/>
+        </w:rPr>
+      </w:pPr>
       <w:proofErr w:type="spellStart"/>
       <w:r>
         <w:rPr>
@@ -795,28 +840,34 @@
     </w:p>
     <w:p>
       <w:pPr>
-        <w:rPr>
-          <w:rFonts w:cs="Times New Roman"/>
-          <w:sz w:val="26"/>
-          <w:szCs w:val="26"/>
-        </w:rPr>
-      </w:pPr>
-      <w:r>
-        <w:rPr>
-          <w:rFonts w:cs="Times New Roman"/>
-          <w:sz w:val="26"/>
-          <w:szCs w:val="26"/>
-        </w:rPr>
-        <w:t xml:space="preserve">→ </w:t>
-      </w:r>
-      <w:proofErr w:type="spellStart"/>
-      <w:r>
-        <w:rPr>
-          <w:rFonts w:cs="Times New Roman"/>
-          <w:sz w:val="26"/>
-          <w:szCs w:val="26"/>
-        </w:rPr>
-        <w:t>Người</w:t>
+        <w:pStyle w:val="ListParagraph"/>
+        <w:numPr>
+          <w:ilvl w:val="0"/>
+          <w:numId w:val="8"/>
+        </w:numPr>
+        <w:spacing w:after="120" w:line="360" w:lineRule="auto"/>
+        <w:rPr>
+          <w:rFonts w:cs="Times New Roman"/>
+          <w:sz w:val="26"/>
+          <w:szCs w:val="26"/>
+        </w:rPr>
+      </w:pPr>
+      <w:proofErr w:type="spellStart"/>
+      <w:r>
+        <w:rPr>
+          <w:rFonts w:cs="Times New Roman"/>
+          <w:sz w:val="26"/>
+          <w:szCs w:val="26"/>
+        </w:rPr>
+        <w:t>N</w:t>
+      </w:r>
+      <w:r>
+        <w:rPr>
+          <w:rFonts w:cs="Times New Roman"/>
+          <w:sz w:val="26"/>
+          <w:szCs w:val="26"/>
+        </w:rPr>
+        <w:t>gười</w:t>
       </w:r>
       <w:proofErr w:type="spellEnd"/>
       <w:r>
@@ -984,20 +1035,18 @@
     </w:p>
     <w:p>
       <w:pPr>
-        <w:rPr>
-          <w:rFonts w:cs="Times New Roman"/>
-          <w:sz w:val="26"/>
-          <w:szCs w:val="26"/>
-        </w:rPr>
-      </w:pPr>
-      <w:r>
-        <w:rPr>
-          <w:rFonts w:cs="Times New Roman"/>
-          <w:sz w:val="26"/>
-          <w:szCs w:val="26"/>
-        </w:rPr>
-        <w:t xml:space="preserve">→ </w:t>
-      </w:r>
+        <w:pStyle w:val="ListParagraph"/>
+        <w:numPr>
+          <w:ilvl w:val="0"/>
+          <w:numId w:val="8"/>
+        </w:numPr>
+        <w:spacing w:after="120" w:line="360" w:lineRule="auto"/>
+        <w:rPr>
+          <w:rFonts w:cs="Times New Roman"/>
+          <w:sz w:val="26"/>
+          <w:szCs w:val="26"/>
+        </w:rPr>
+      </w:pPr>
       <w:proofErr w:type="spellStart"/>
       <w:r>
         <w:rPr>
@@ -1073,19 +1122,25 @@
     </w:p>
     <w:p>
       <w:pPr>
-        <w:rPr>
-          <w:rFonts w:cs="Times New Roman"/>
-          <w:sz w:val="26"/>
-          <w:szCs w:val="26"/>
-        </w:rPr>
-      </w:pPr>
-      <w:r>
-        <w:rPr>
-          <w:rFonts w:cs="Times New Roman"/>
-          <w:sz w:val="26"/>
-          <w:szCs w:val="26"/>
-        </w:rPr>
-        <w:t xml:space="preserve">→ Ticket </w:t>
+        <w:pStyle w:val="ListParagraph"/>
+        <w:numPr>
+          <w:ilvl w:val="0"/>
+          <w:numId w:val="8"/>
+        </w:numPr>
+        <w:spacing w:after="120" w:line="360" w:lineRule="auto"/>
+        <w:rPr>
+          <w:rFonts w:cs="Times New Roman"/>
+          <w:sz w:val="26"/>
+          <w:szCs w:val="26"/>
+        </w:rPr>
+      </w:pPr>
+      <w:r>
+        <w:rPr>
+          <w:rFonts w:cs="Times New Roman"/>
+          <w:sz w:val="26"/>
+          <w:szCs w:val="26"/>
+        </w:rPr>
+        <w:t xml:space="preserve">Ticket </w:t>
       </w:r>
       <w:proofErr w:type="spellStart"/>
       <w:r>
@@ -1172,20 +1227,18 @@
     </w:p>
     <w:p>
       <w:pPr>
-        <w:rPr>
-          <w:rFonts w:cs="Times New Roman"/>
-          <w:sz w:val="26"/>
-          <w:szCs w:val="26"/>
-        </w:rPr>
-      </w:pPr>
-      <w:r>
-        <w:rPr>
-          <w:rFonts w:cs="Times New Roman"/>
-          <w:sz w:val="26"/>
-          <w:szCs w:val="26"/>
-        </w:rPr>
-        <w:t xml:space="preserve">→ </w:t>
-      </w:r>
+        <w:pStyle w:val="ListParagraph"/>
+        <w:numPr>
+          <w:ilvl w:val="0"/>
+          <w:numId w:val="8"/>
+        </w:numPr>
+        <w:spacing w:after="120" w:line="360" w:lineRule="auto"/>
+        <w:rPr>
+          <w:rFonts w:cs="Times New Roman"/>
+          <w:sz w:val="26"/>
+          <w:szCs w:val="26"/>
+        </w:rPr>
+      </w:pPr>
       <w:proofErr w:type="spellStart"/>
       <w:r>
         <w:rPr>
@@ -1307,19 +1360,25 @@
     </w:p>
     <w:p>
       <w:pPr>
-        <w:rPr>
-          <w:rFonts w:cs="Times New Roman"/>
-          <w:sz w:val="26"/>
-          <w:szCs w:val="26"/>
-        </w:rPr>
-      </w:pPr>
-      <w:r>
-        <w:rPr>
-          <w:rFonts w:cs="Times New Roman"/>
-          <w:sz w:val="26"/>
-          <w:szCs w:val="26"/>
-        </w:rPr>
-        <w:t xml:space="preserve">→ Ticket </w:t>
+        <w:pStyle w:val="ListParagraph"/>
+        <w:numPr>
+          <w:ilvl w:val="0"/>
+          <w:numId w:val="8"/>
+        </w:numPr>
+        <w:spacing w:after="120" w:line="360" w:lineRule="auto"/>
+        <w:rPr>
+          <w:rFonts w:cs="Times New Roman"/>
+          <w:sz w:val="26"/>
+          <w:szCs w:val="26"/>
+        </w:rPr>
+      </w:pPr>
+      <w:r>
+        <w:rPr>
+          <w:rFonts w:cs="Times New Roman"/>
+          <w:sz w:val="26"/>
+          <w:szCs w:val="26"/>
+        </w:rPr>
+        <w:t xml:space="preserve">Ticket </w:t>
       </w:r>
       <w:proofErr w:type="spellStart"/>
       <w:r>
@@ -1433,7 +1492,17 @@
     <w:p>
       <w:pPr>
         <w:pStyle w:val="Heading2"/>
-      </w:pPr>
+        <w:spacing w:after="120" w:line="360" w:lineRule="auto"/>
+      </w:pPr>
+      <w:r>
+        <w:t>1</w:t>
+      </w:r>
+      <w:r>
+        <w:rPr>
+          <w:lang w:val="vi-VN"/>
+        </w:rPr>
+        <w:t>.</w:t>
+      </w:r>
       <w:r>
         <w:t xml:space="preserve">3. Vai </w:t>
       </w:r>
@@ -1461,6 +1530,7 @@
     </w:p>
     <w:p>
       <w:pPr>
+        <w:spacing w:after="120" w:line="360" w:lineRule="auto"/>
         <w:rPr>
           <w:rFonts w:cs="Times New Roman"/>
           <w:i/>
@@ -1550,10 +1620,13 @@
     </w:p>
     <w:p>
       <w:pPr>
+        <w:pStyle w:val="ListParagraph"/>
         <w:numPr>
           <w:ilvl w:val="0"/>
-          <w:numId w:val="2"/>
+          <w:numId w:val="9"/>
         </w:numPr>
+        <w:spacing w:after="120" w:line="360" w:lineRule="auto"/>
+        <w:ind w:left="709"/>
         <w:rPr>
           <w:rFonts w:cs="Times New Roman"/>
           <w:sz w:val="26"/>
@@ -1581,10 +1654,13 @@
     </w:p>
     <w:p>
       <w:pPr>
+        <w:pStyle w:val="ListParagraph"/>
         <w:numPr>
           <w:ilvl w:val="0"/>
-          <w:numId w:val="2"/>
+          <w:numId w:val="9"/>
         </w:numPr>
+        <w:spacing w:after="120" w:line="360" w:lineRule="auto"/>
+        <w:ind w:left="709"/>
         <w:rPr>
           <w:rFonts w:cs="Times New Roman"/>
           <w:sz w:val="26"/>
@@ -1666,10 +1742,13 @@
     </w:p>
     <w:p>
       <w:pPr>
+        <w:pStyle w:val="ListParagraph"/>
         <w:numPr>
           <w:ilvl w:val="0"/>
-          <w:numId w:val="2"/>
+          <w:numId w:val="9"/>
         </w:numPr>
+        <w:spacing w:after="120" w:line="360" w:lineRule="auto"/>
+        <w:ind w:left="709"/>
         <w:rPr>
           <w:rFonts w:cs="Times New Roman"/>
           <w:sz w:val="26"/>
@@ -1741,10 +1820,13 @@
     </w:p>
     <w:p>
       <w:pPr>
+        <w:pStyle w:val="ListParagraph"/>
         <w:numPr>
           <w:ilvl w:val="0"/>
-          <w:numId w:val="2"/>
+          <w:numId w:val="9"/>
         </w:numPr>
+        <w:spacing w:after="120" w:line="360" w:lineRule="auto"/>
+        <w:ind w:left="709"/>
         <w:rPr>
           <w:rFonts w:cs="Times New Roman"/>
           <w:sz w:val="26"/>
@@ -1852,10 +1934,13 @@
     </w:p>
     <w:p>
       <w:pPr>
+        <w:pStyle w:val="ListParagraph"/>
         <w:numPr>
           <w:ilvl w:val="0"/>
-          <w:numId w:val="2"/>
+          <w:numId w:val="9"/>
         </w:numPr>
+        <w:spacing w:after="120" w:line="360" w:lineRule="auto"/>
+        <w:ind w:left="709"/>
         <w:rPr>
           <w:rFonts w:cs="Times New Roman"/>
           <w:sz w:val="26"/>
@@ -1937,10 +2022,13 @@
     </w:p>
     <w:p>
       <w:pPr>
+        <w:pStyle w:val="ListParagraph"/>
         <w:numPr>
           <w:ilvl w:val="0"/>
-          <w:numId w:val="2"/>
+          <w:numId w:val="9"/>
         </w:numPr>
+        <w:spacing w:after="120" w:line="360" w:lineRule="auto"/>
+        <w:ind w:left="709"/>
         <w:rPr>
           <w:rFonts w:cs="Times New Roman"/>
           <w:sz w:val="26"/>
@@ -2058,10 +2146,13 @@
     </w:p>
     <w:p>
       <w:pPr>
+        <w:pStyle w:val="ListParagraph"/>
         <w:numPr>
           <w:ilvl w:val="0"/>
-          <w:numId w:val="2"/>
+          <w:numId w:val="9"/>
         </w:numPr>
+        <w:spacing w:after="120" w:line="360" w:lineRule="auto"/>
+        <w:ind w:left="709"/>
         <w:rPr>
           <w:rFonts w:cs="Times New Roman"/>
           <w:sz w:val="26"/>
@@ -2169,7 +2260,6 @@
           <w:szCs w:val="26"/>
         </w:rPr>
       </w:pPr>
-      <w:proofErr w:type="spellStart"/>
       <w:r>
         <w:rPr>
           <w:rFonts w:cs="Times New Roman"/>
@@ -2178,10 +2268,12 @@
           <w:sz w:val="26"/>
           <w:szCs w:val="26"/>
         </w:rPr>
-        <w:t>Người</w:t>
-      </w:r>
-      <w:proofErr w:type="spellEnd"/>
-      <w:r>
+        <w:br w:type="page"/>
+      </w:r>
+    </w:p>
+    <w:p>
+      <w:pPr>
+        <w:spacing w:after="120" w:line="360" w:lineRule="auto"/>
         <w:rPr>
           <w:rFonts w:cs="Times New Roman"/>
           <w:i/>
@@ -2189,8 +2281,7 @@
           <w:sz w:val="26"/>
           <w:szCs w:val="26"/>
         </w:rPr>
-        <w:t xml:space="preserve"> </w:t>
-      </w:r>
+      </w:pPr>
       <w:proofErr w:type="spellStart"/>
       <w:r>
         <w:rPr>
@@ -2200,7 +2291,8 @@
           <w:sz w:val="26"/>
           <w:szCs w:val="26"/>
         </w:rPr>
-        <w:t>xử</w:t>
+        <w:lastRenderedPageBreak/>
+        <w:t>Người</w:t>
       </w:r>
       <w:proofErr w:type="spellEnd"/>
       <w:r>
@@ -2222,29 +2314,53 @@
           <w:sz w:val="26"/>
           <w:szCs w:val="26"/>
         </w:rPr>
+        <w:t>xử</w:t>
+      </w:r>
+      <w:proofErr w:type="spellEnd"/>
+      <w:r>
+        <w:rPr>
+          <w:rFonts w:cs="Times New Roman"/>
+          <w:i/>
+          <w:iCs/>
+          <w:sz w:val="26"/>
+          <w:szCs w:val="26"/>
+        </w:rPr>
+        <w:t xml:space="preserve"> </w:t>
+      </w:r>
+      <w:proofErr w:type="spellStart"/>
+      <w:r>
+        <w:rPr>
+          <w:rFonts w:cs="Times New Roman"/>
+          <w:i/>
+          <w:iCs/>
+          <w:sz w:val="26"/>
+          <w:szCs w:val="26"/>
+        </w:rPr>
         <w:t>lý</w:t>
       </w:r>
       <w:proofErr w:type="spellEnd"/>
     </w:p>
     <w:p>
       <w:pPr>
+        <w:pStyle w:val="ListParagraph"/>
         <w:numPr>
           <w:ilvl w:val="0"/>
-          <w:numId w:val="3"/>
+          <w:numId w:val="10"/>
         </w:numPr>
-        <w:rPr>
-          <w:rFonts w:cs="Times New Roman"/>
-          <w:sz w:val="26"/>
-          <w:szCs w:val="26"/>
-        </w:rPr>
-      </w:pPr>
-      <w:r>
-        <w:rPr>
-          <w:rFonts w:cs="Times New Roman"/>
-          <w:sz w:val="26"/>
-          <w:szCs w:val="26"/>
-        </w:rPr>
-        <w:lastRenderedPageBreak/>
+        <w:spacing w:after="120" w:line="360" w:lineRule="auto"/>
+        <w:ind w:left="709"/>
+        <w:rPr>
+          <w:rFonts w:cs="Times New Roman"/>
+          <w:sz w:val="26"/>
+          <w:szCs w:val="26"/>
+        </w:rPr>
+      </w:pPr>
+      <w:r>
+        <w:rPr>
+          <w:rFonts w:cs="Times New Roman"/>
+          <w:sz w:val="26"/>
+          <w:szCs w:val="26"/>
+        </w:rPr>
         <w:t xml:space="preserve">Xem ticket </w:t>
       </w:r>
       <w:proofErr w:type="spellStart"/>
@@ -2286,10 +2402,13 @@
     </w:p>
     <w:p>
       <w:pPr>
+        <w:pStyle w:val="ListParagraph"/>
         <w:numPr>
           <w:ilvl w:val="0"/>
-          <w:numId w:val="3"/>
+          <w:numId w:val="10"/>
         </w:numPr>
+        <w:spacing w:after="120" w:line="360" w:lineRule="auto"/>
+        <w:ind w:left="709"/>
         <w:rPr>
           <w:rFonts w:cs="Times New Roman"/>
           <w:sz w:val="26"/>
@@ -2425,10 +2544,13 @@
     </w:p>
     <w:p>
       <w:pPr>
+        <w:pStyle w:val="ListParagraph"/>
         <w:numPr>
           <w:ilvl w:val="0"/>
-          <w:numId w:val="3"/>
+          <w:numId w:val="10"/>
         </w:numPr>
+        <w:spacing w:after="120" w:line="360" w:lineRule="auto"/>
+        <w:ind w:left="709"/>
         <w:rPr>
           <w:rFonts w:cs="Times New Roman"/>
           <w:sz w:val="26"/>
@@ -2518,10 +2640,13 @@
     </w:p>
     <w:p>
       <w:pPr>
+        <w:pStyle w:val="ListParagraph"/>
         <w:numPr>
           <w:ilvl w:val="0"/>
-          <w:numId w:val="3"/>
+          <w:numId w:val="10"/>
         </w:numPr>
+        <w:spacing w:after="120" w:line="360" w:lineRule="auto"/>
+        <w:ind w:left="709"/>
         <w:rPr>
           <w:rFonts w:cs="Times New Roman"/>
           <w:sz w:val="26"/>
@@ -2621,10 +2746,13 @@
     </w:p>
     <w:p>
       <w:pPr>
+        <w:pStyle w:val="ListParagraph"/>
         <w:numPr>
           <w:ilvl w:val="0"/>
-          <w:numId w:val="3"/>
+          <w:numId w:val="10"/>
         </w:numPr>
+        <w:spacing w:after="120" w:line="360" w:lineRule="auto"/>
+        <w:ind w:left="709"/>
         <w:rPr>
           <w:rFonts w:cs="Times New Roman"/>
           <w:sz w:val="26"/>
@@ -2706,10 +2834,13 @@
     </w:p>
     <w:p>
       <w:pPr>
+        <w:pStyle w:val="ListParagraph"/>
         <w:numPr>
           <w:ilvl w:val="0"/>
-          <w:numId w:val="3"/>
+          <w:numId w:val="10"/>
         </w:numPr>
+        <w:spacing w:after="120" w:line="360" w:lineRule="auto"/>
+        <w:ind w:left="709"/>
         <w:rPr>
           <w:rFonts w:cs="Times New Roman"/>
           <w:sz w:val="26"/>
@@ -2781,6 +2912,7 @@
     </w:p>
     <w:p>
       <w:pPr>
+        <w:spacing w:after="120" w:line="360" w:lineRule="auto"/>
         <w:rPr>
           <w:rFonts w:cs="Times New Roman"/>
           <w:i/>
@@ -2836,10 +2968,13 @@
     </w:p>
     <w:p>
       <w:pPr>
+        <w:pStyle w:val="ListParagraph"/>
         <w:numPr>
           <w:ilvl w:val="0"/>
-          <w:numId w:val="4"/>
+          <w:numId w:val="11"/>
         </w:numPr>
+        <w:spacing w:after="120" w:line="360" w:lineRule="auto"/>
+        <w:ind w:left="709"/>
         <w:rPr>
           <w:rFonts w:cs="Times New Roman"/>
           <w:sz w:val="26"/>
@@ -2965,10 +3100,13 @@
     </w:p>
     <w:p>
       <w:pPr>
+        <w:pStyle w:val="ListParagraph"/>
         <w:numPr>
           <w:ilvl w:val="0"/>
-          <w:numId w:val="4"/>
+          <w:numId w:val="11"/>
         </w:numPr>
+        <w:spacing w:after="120" w:line="360" w:lineRule="auto"/>
+        <w:ind w:left="709"/>
         <w:rPr>
           <w:rFonts w:cs="Times New Roman"/>
           <w:sz w:val="26"/>
@@ -3130,10 +3268,13 @@
     </w:p>
     <w:p>
       <w:pPr>
+        <w:pStyle w:val="ListParagraph"/>
         <w:numPr>
           <w:ilvl w:val="0"/>
-          <w:numId w:val="4"/>
+          <w:numId w:val="11"/>
         </w:numPr>
+        <w:spacing w:after="120" w:line="360" w:lineRule="auto"/>
+        <w:ind w:left="709"/>
         <w:rPr>
           <w:rFonts w:cs="Times New Roman"/>
           <w:sz w:val="26"/>
@@ -3251,10 +3392,13 @@
     </w:p>
     <w:p>
       <w:pPr>
+        <w:pStyle w:val="ListParagraph"/>
         <w:numPr>
           <w:ilvl w:val="0"/>
-          <w:numId w:val="4"/>
+          <w:numId w:val="11"/>
         </w:numPr>
+        <w:spacing w:after="120" w:line="360" w:lineRule="auto"/>
+        <w:ind w:left="709"/>
         <w:rPr>
           <w:rFonts w:cs="Times New Roman"/>
           <w:sz w:val="26"/>
@@ -3380,10 +3524,13 @@
     </w:p>
     <w:p>
       <w:pPr>
+        <w:pStyle w:val="ListParagraph"/>
         <w:numPr>
           <w:ilvl w:val="0"/>
-          <w:numId w:val="4"/>
+          <w:numId w:val="11"/>
         </w:numPr>
+        <w:spacing w:after="120" w:line="360" w:lineRule="auto"/>
+        <w:ind w:left="709"/>
         <w:rPr>
           <w:rFonts w:cs="Times New Roman"/>
           <w:sz w:val="26"/>
@@ -3420,7 +3567,17 @@
     <w:p>
       <w:pPr>
         <w:pStyle w:val="Heading2"/>
-      </w:pPr>
+        <w:spacing w:after="120" w:line="360" w:lineRule="auto"/>
+      </w:pPr>
+      <w:r>
+        <w:t>1</w:t>
+      </w:r>
+      <w:r>
+        <w:rPr>
+          <w:lang w:val="vi-VN"/>
+        </w:rPr>
+        <w:t>.</w:t>
+      </w:r>
       <w:r>
         <w:t xml:space="preserve">4. </w:t>
       </w:r>
@@ -3459,10 +3616,13 @@
     </w:p>
     <w:p>
       <w:pPr>
+        <w:pStyle w:val="ListParagraph"/>
         <w:numPr>
           <w:ilvl w:val="0"/>
-          <w:numId w:val="5"/>
+          <w:numId w:val="12"/>
         </w:numPr>
+        <w:spacing w:after="120" w:line="360" w:lineRule="auto"/>
+        <w:ind w:left="709"/>
         <w:rPr>
           <w:rFonts w:cs="Times New Roman"/>
           <w:sz w:val="26"/>
@@ -3580,10 +3740,13 @@
     </w:p>
     <w:p>
       <w:pPr>
+        <w:pStyle w:val="ListParagraph"/>
         <w:numPr>
           <w:ilvl w:val="0"/>
-          <w:numId w:val="5"/>
+          <w:numId w:val="12"/>
         </w:numPr>
+        <w:spacing w:after="120" w:line="360" w:lineRule="auto"/>
+        <w:ind w:left="709"/>
         <w:rPr>
           <w:rFonts w:cs="Times New Roman"/>
           <w:sz w:val="26"/>
@@ -3665,10 +3828,13 @@
     </w:p>
     <w:p>
       <w:pPr>
+        <w:pStyle w:val="ListParagraph"/>
         <w:numPr>
           <w:ilvl w:val="0"/>
-          <w:numId w:val="5"/>
+          <w:numId w:val="12"/>
         </w:numPr>
+        <w:spacing w:after="120" w:line="360" w:lineRule="auto"/>
+        <w:ind w:left="709"/>
         <w:rPr>
           <w:rFonts w:cs="Times New Roman"/>
           <w:sz w:val="26"/>
@@ -3750,10 +3916,13 @@
     </w:p>
     <w:p>
       <w:pPr>
+        <w:pStyle w:val="ListParagraph"/>
         <w:numPr>
           <w:ilvl w:val="0"/>
-          <w:numId w:val="5"/>
+          <w:numId w:val="12"/>
         </w:numPr>
+        <w:spacing w:after="120" w:line="360" w:lineRule="auto"/>
+        <w:ind w:left="709"/>
         <w:rPr>
           <w:rFonts w:cs="Times New Roman"/>
           <w:sz w:val="26"/>
@@ -3889,10 +4058,13 @@
     </w:p>
     <w:p>
       <w:pPr>
+        <w:pStyle w:val="ListParagraph"/>
         <w:numPr>
           <w:ilvl w:val="0"/>
-          <w:numId w:val="5"/>
+          <w:numId w:val="12"/>
         </w:numPr>
+        <w:spacing w:after="120" w:line="360" w:lineRule="auto"/>
+        <w:ind w:left="709"/>
         <w:rPr>
           <w:rFonts w:cs="Times New Roman"/>
           <w:sz w:val="26"/>
@@ -3992,10 +4164,13 @@
     </w:p>
     <w:p>
       <w:pPr>
+        <w:pStyle w:val="ListParagraph"/>
         <w:numPr>
           <w:ilvl w:val="0"/>
-          <w:numId w:val="5"/>
+          <w:numId w:val="12"/>
         </w:numPr>
+        <w:spacing w:after="120" w:line="360" w:lineRule="auto"/>
+        <w:ind w:left="709"/>
         <w:rPr>
           <w:rFonts w:cs="Times New Roman"/>
           <w:sz w:val="26"/>
@@ -4077,10 +4252,13 @@
     </w:p>
     <w:p>
       <w:pPr>
+        <w:pStyle w:val="ListParagraph"/>
         <w:numPr>
           <w:ilvl w:val="0"/>
-          <w:numId w:val="5"/>
+          <w:numId w:val="12"/>
         </w:numPr>
+        <w:spacing w:after="120" w:line="360" w:lineRule="auto"/>
+        <w:ind w:left="709"/>
         <w:rPr>
           <w:rFonts w:cs="Times New Roman"/>
           <w:sz w:val="26"/>
@@ -4224,10 +4402,13 @@
     </w:p>
     <w:p>
       <w:pPr>
+        <w:pStyle w:val="ListParagraph"/>
         <w:numPr>
           <w:ilvl w:val="0"/>
-          <w:numId w:val="5"/>
+          <w:numId w:val="12"/>
         </w:numPr>
+        <w:spacing w:after="120" w:line="360" w:lineRule="auto"/>
+        <w:ind w:left="709"/>
         <w:rPr>
           <w:rFonts w:cs="Times New Roman"/>
           <w:sz w:val="26"/>
@@ -4353,10 +4534,13 @@
     </w:p>
     <w:p>
       <w:pPr>
+        <w:pStyle w:val="ListParagraph"/>
         <w:numPr>
           <w:ilvl w:val="0"/>
-          <w:numId w:val="5"/>
+          <w:numId w:val="12"/>
         </w:numPr>
+        <w:spacing w:after="120" w:line="360" w:lineRule="auto"/>
+        <w:ind w:left="709"/>
         <w:rPr>
           <w:rFonts w:cs="Times New Roman"/>
           <w:sz w:val="26"/>
@@ -4492,10 +4676,13 @@
     </w:p>
     <w:p>
       <w:pPr>
+        <w:pStyle w:val="ListParagraph"/>
         <w:numPr>
           <w:ilvl w:val="0"/>
-          <w:numId w:val="5"/>
+          <w:numId w:val="12"/>
         </w:numPr>
+        <w:spacing w:after="120" w:line="360" w:lineRule="auto"/>
+        <w:ind w:left="709"/>
         <w:rPr>
           <w:rFonts w:cs="Times New Roman"/>
           <w:sz w:val="26"/>
@@ -4595,10 +4782,13 @@
     </w:p>
     <w:p>
       <w:pPr>
+        <w:pStyle w:val="ListParagraph"/>
         <w:numPr>
           <w:ilvl w:val="0"/>
-          <w:numId w:val="5"/>
+          <w:numId w:val="12"/>
         </w:numPr>
+        <w:spacing w:after="120" w:line="360" w:lineRule="auto"/>
+        <w:ind w:left="709"/>
         <w:rPr>
           <w:rFonts w:cs="Times New Roman"/>
           <w:sz w:val="26"/>
@@ -4698,10 +4888,13 @@
     </w:p>
     <w:p>
       <w:pPr>
+        <w:pStyle w:val="ListParagraph"/>
         <w:numPr>
           <w:ilvl w:val="0"/>
-          <w:numId w:val="5"/>
+          <w:numId w:val="12"/>
         </w:numPr>
+        <w:spacing w:after="120" w:line="360" w:lineRule="auto"/>
+        <w:ind w:left="709"/>
         <w:rPr>
           <w:rFonts w:cs="Times New Roman"/>
           <w:sz w:val="26"/>
@@ -4719,10 +4912,13 @@
     </w:p>
     <w:p>
       <w:pPr>
+        <w:pStyle w:val="ListParagraph"/>
         <w:numPr>
           <w:ilvl w:val="0"/>
-          <w:numId w:val="5"/>
+          <w:numId w:val="12"/>
         </w:numPr>
+        <w:spacing w:after="120" w:line="360" w:lineRule="auto"/>
+        <w:ind w:left="709"/>
         <w:rPr>
           <w:rFonts w:cs="Times New Roman"/>
           <w:sz w:val="26"/>
@@ -4740,24 +4936,26 @@
     </w:p>
     <w:p>
       <w:pPr>
+        <w:pStyle w:val="ListParagraph"/>
         <w:numPr>
           <w:ilvl w:val="0"/>
-          <w:numId w:val="5"/>
+          <w:numId w:val="12"/>
         </w:numPr>
-        <w:rPr>
-          <w:rFonts w:cs="Times New Roman"/>
-          <w:sz w:val="26"/>
-          <w:szCs w:val="26"/>
-        </w:rPr>
-      </w:pPr>
-      <w:proofErr w:type="spellStart"/>
-      <w:r>
-        <w:rPr>
-          <w:rFonts w:cs="Times New Roman"/>
-          <w:sz w:val="26"/>
-          <w:szCs w:val="26"/>
-        </w:rPr>
-        <w:lastRenderedPageBreak/>
+        <w:spacing w:after="120" w:line="360" w:lineRule="auto"/>
+        <w:ind w:left="709"/>
+        <w:rPr>
+          <w:rFonts w:cs="Times New Roman"/>
+          <w:sz w:val="26"/>
+          <w:szCs w:val="26"/>
+        </w:rPr>
+      </w:pPr>
+      <w:proofErr w:type="spellStart"/>
+      <w:r>
+        <w:rPr>
+          <w:rFonts w:cs="Times New Roman"/>
+          <w:sz w:val="26"/>
+          <w:szCs w:val="26"/>
+        </w:rPr>
         <w:t>Dữ</w:t>
       </w:r>
       <w:proofErr w:type="spellEnd"/>
@@ -4881,7 +5079,18 @@
     <w:p>
       <w:pPr>
         <w:pStyle w:val="Heading2"/>
-      </w:pPr>
+        <w:spacing w:after="120" w:line="360" w:lineRule="auto"/>
+      </w:pPr>
+      <w:r>
+        <w:lastRenderedPageBreak/>
+        <w:t>1</w:t>
+      </w:r>
+      <w:r>
+        <w:rPr>
+          <w:lang w:val="vi-VN"/>
+        </w:rPr>
+        <w:t>.</w:t>
+      </w:r>
       <w:r>
         <w:t xml:space="preserve">5. </w:t>
       </w:r>
@@ -4904,10 +5113,13 @@
     </w:p>
     <w:p>
       <w:pPr>
+        <w:pStyle w:val="ListParagraph"/>
         <w:numPr>
           <w:ilvl w:val="0"/>
-          <w:numId w:val="6"/>
+          <w:numId w:val="13"/>
         </w:numPr>
+        <w:spacing w:after="120" w:line="360" w:lineRule="auto"/>
+        <w:ind w:left="709"/>
         <w:rPr>
           <w:rFonts w:cs="Times New Roman"/>
           <w:sz w:val="26"/>
@@ -4925,10 +5137,13 @@
     </w:p>
     <w:p>
       <w:pPr>
+        <w:pStyle w:val="ListParagraph"/>
         <w:numPr>
           <w:ilvl w:val="0"/>
-          <w:numId w:val="6"/>
+          <w:numId w:val="13"/>
         </w:numPr>
+        <w:spacing w:after="120" w:line="360" w:lineRule="auto"/>
+        <w:ind w:left="709"/>
         <w:rPr>
           <w:rFonts w:cs="Times New Roman"/>
           <w:sz w:val="26"/>
@@ -4946,10 +5161,13 @@
     </w:p>
     <w:p>
       <w:pPr>
+        <w:pStyle w:val="ListParagraph"/>
         <w:numPr>
           <w:ilvl w:val="0"/>
-          <w:numId w:val="6"/>
+          <w:numId w:val="13"/>
         </w:numPr>
+        <w:spacing w:after="120" w:line="360" w:lineRule="auto"/>
+        <w:ind w:left="709"/>
         <w:rPr>
           <w:rFonts w:cs="Times New Roman"/>
           <w:sz w:val="26"/>
@@ -5031,10 +5249,13 @@
     </w:p>
     <w:p>
       <w:pPr>
+        <w:pStyle w:val="ListParagraph"/>
         <w:numPr>
           <w:ilvl w:val="0"/>
-          <w:numId w:val="6"/>
+          <w:numId w:val="13"/>
         </w:numPr>
+        <w:spacing w:after="120" w:line="360" w:lineRule="auto"/>
+        <w:ind w:left="709"/>
         <w:rPr>
           <w:rFonts w:cs="Times New Roman"/>
           <w:sz w:val="26"/>
@@ -5080,10 +5301,13 @@
     </w:p>
     <w:p>
       <w:pPr>
+        <w:pStyle w:val="ListParagraph"/>
         <w:numPr>
           <w:ilvl w:val="0"/>
-          <w:numId w:val="6"/>
+          <w:numId w:val="13"/>
         </w:numPr>
+        <w:spacing w:after="120" w:line="360" w:lineRule="auto"/>
+        <w:ind w:left="709"/>
         <w:rPr>
           <w:rFonts w:cs="Times New Roman"/>
           <w:sz w:val="26"/>
@@ -5147,10 +5371,13 @@
     </w:p>
     <w:p>
       <w:pPr>
+        <w:pStyle w:val="ListParagraph"/>
         <w:numPr>
           <w:ilvl w:val="0"/>
-          <w:numId w:val="6"/>
+          <w:numId w:val="13"/>
         </w:numPr>
+        <w:spacing w:after="120" w:line="360" w:lineRule="auto"/>
+        <w:ind w:left="709"/>
         <w:rPr>
           <w:rFonts w:cs="Times New Roman"/>
           <w:sz w:val="26"/>
@@ -5196,10 +5423,13 @@
     </w:p>
     <w:p>
       <w:pPr>
+        <w:pStyle w:val="ListParagraph"/>
         <w:numPr>
           <w:ilvl w:val="0"/>
-          <w:numId w:val="6"/>
+          <w:numId w:val="13"/>
         </w:numPr>
+        <w:spacing w:after="120" w:line="360" w:lineRule="auto"/>
+        <w:ind w:left="709"/>
         <w:rPr>
           <w:rFonts w:cs="Times New Roman"/>
           <w:sz w:val="26"/>
@@ -5353,10 +5583,13 @@
     </w:p>
     <w:p>
       <w:pPr>
+        <w:pStyle w:val="ListParagraph"/>
         <w:numPr>
           <w:ilvl w:val="0"/>
-          <w:numId w:val="6"/>
+          <w:numId w:val="13"/>
         </w:numPr>
+        <w:spacing w:after="120" w:line="360" w:lineRule="auto"/>
+        <w:ind w:left="709"/>
         <w:rPr>
           <w:rFonts w:cs="Times New Roman"/>
           <w:sz w:val="26"/>
@@ -5583,7 +5816,17 @@
     <w:p>
       <w:pPr>
         <w:pStyle w:val="Heading2"/>
-      </w:pPr>
+        <w:spacing w:after="120" w:line="360" w:lineRule="auto"/>
+      </w:pPr>
+      <w:r>
+        <w:t>1</w:t>
+      </w:r>
+      <w:r>
+        <w:rPr>
+          <w:lang w:val="vi-VN"/>
+        </w:rPr>
+        <w:t>.</w:t>
+      </w:r>
       <w:r>
         <w:t xml:space="preserve">6. </w:t>
       </w:r>
@@ -5619,6 +5862,7 @@
     </w:p>
     <w:p>
       <w:pPr>
+        <w:spacing w:after="120" w:line="360" w:lineRule="auto"/>
         <w:rPr>
           <w:rFonts w:cs="Times New Roman"/>
           <w:sz w:val="26"/>
@@ -5844,10 +6088,13 @@
     </w:p>
     <w:p>
       <w:pPr>
+        <w:pStyle w:val="ListParagraph"/>
         <w:numPr>
           <w:ilvl w:val="0"/>
-          <w:numId w:val="7"/>
+          <w:numId w:val="14"/>
         </w:numPr>
+        <w:spacing w:after="120" w:line="360" w:lineRule="auto"/>
+        <w:ind w:left="709"/>
         <w:rPr>
           <w:rFonts w:cs="Times New Roman"/>
           <w:sz w:val="26"/>
@@ -5901,10 +6148,13 @@
     </w:p>
     <w:p>
       <w:pPr>
+        <w:pStyle w:val="ListParagraph"/>
         <w:numPr>
           <w:ilvl w:val="0"/>
-          <w:numId w:val="7"/>
+          <w:numId w:val="14"/>
         </w:numPr>
+        <w:spacing w:after="120" w:line="360" w:lineRule="auto"/>
+        <w:ind w:left="709"/>
         <w:rPr>
           <w:rFonts w:cs="Times New Roman"/>
           <w:sz w:val="26"/>
@@ -5976,10 +6226,13 @@
     </w:p>
     <w:p>
       <w:pPr>
+        <w:pStyle w:val="ListParagraph"/>
         <w:numPr>
           <w:ilvl w:val="0"/>
-          <w:numId w:val="7"/>
+          <w:numId w:val="14"/>
         </w:numPr>
+        <w:spacing w:after="120" w:line="360" w:lineRule="auto"/>
+        <w:ind w:left="709"/>
         <w:rPr>
           <w:rFonts w:cs="Times New Roman"/>
           <w:sz w:val="26"/>
@@ -6033,10 +6286,13 @@
     </w:p>
     <w:p>
       <w:pPr>
+        <w:pStyle w:val="ListParagraph"/>
         <w:numPr>
           <w:ilvl w:val="0"/>
-          <w:numId w:val="7"/>
+          <w:numId w:val="14"/>
         </w:numPr>
+        <w:spacing w:after="120" w:line="360" w:lineRule="auto"/>
+        <w:ind w:left="709"/>
         <w:rPr>
           <w:rFonts w:cs="Times New Roman"/>
           <w:sz w:val="26"/>
@@ -6090,10 +6346,13 @@
     </w:p>
     <w:p>
       <w:pPr>
+        <w:pStyle w:val="ListParagraph"/>
         <w:numPr>
           <w:ilvl w:val="0"/>
-          <w:numId w:val="7"/>
+          <w:numId w:val="14"/>
         </w:numPr>
+        <w:spacing w:after="120" w:line="360" w:lineRule="auto"/>
+        <w:ind w:left="709"/>
         <w:rPr>
           <w:rFonts w:cs="Times New Roman"/>
           <w:sz w:val="26"/>
@@ -6165,10 +6424,13 @@
     </w:p>
     <w:p>
       <w:pPr>
+        <w:pStyle w:val="ListParagraph"/>
         <w:numPr>
           <w:ilvl w:val="0"/>
-          <w:numId w:val="7"/>
+          <w:numId w:val="14"/>
         </w:numPr>
+        <w:spacing w:after="120" w:line="360" w:lineRule="auto"/>
+        <w:ind w:left="709"/>
         <w:rPr>
           <w:rFonts w:cs="Times New Roman"/>
           <w:sz w:val="26"/>
@@ -6237,18 +6499,9 @@
         </w:rPr>
         <w:t>.</w:t>
       </w:r>
-    </w:p>
-    <w:p>
-      <w:pPr>
-        <w:rPr>
-          <w:rFonts w:cs="Times New Roman"/>
-          <w:sz w:val="26"/>
-          <w:szCs w:val="26"/>
-        </w:rPr>
-      </w:pPr>
     </w:p>
     <w:sectPr>
-      <w:pgSz w:w="12240" w:h="15840"/>
+      <w:pgSz w:w="11906" w:h="16838" w:code="9"/>
       <w:pgMar w:top="1440" w:right="1440" w:bottom="1440" w:left="1440" w:header="708" w:footer="708" w:gutter="0"/>
       <w:cols w:space="708"/>
       <w:docGrid w:linePitch="360"/>
@@ -6409,6 +6662,232 @@
     </w:lvl>
   </w:abstractNum>
   <w:abstractNum w:abstractNumId="1" w15:restartNumberingAfterBreak="0">
+    <w:nsid w:val="0DCF018B"/>
+    <w:multiLevelType w:val="hybridMultilevel"/>
+    <w:tmpl w:val="D0FCC9FE"/>
+    <w:lvl w:ilvl="0" w:tplc="04090001">
+      <w:start w:val="1"/>
+      <w:numFmt w:val="bullet"/>
+      <w:lvlText w:val=""/>
+      <w:lvlJc w:val="left"/>
+      <w:pPr>
+        <w:ind w:left="720" w:hanging="360"/>
+      </w:pPr>
+      <w:rPr>
+        <w:rFonts w:ascii="Symbol" w:hAnsi="Symbol" w:hint="default"/>
+      </w:rPr>
+    </w:lvl>
+    <w:lvl w:ilvl="1" w:tplc="04090003" w:tentative="1">
+      <w:start w:val="1"/>
+      <w:numFmt w:val="bullet"/>
+      <w:lvlText w:val="o"/>
+      <w:lvlJc w:val="left"/>
+      <w:pPr>
+        <w:ind w:left="1440" w:hanging="360"/>
+      </w:pPr>
+      <w:rPr>
+        <w:rFonts w:ascii="Courier New" w:hAnsi="Courier New" w:cs="Courier New" w:hint="default"/>
+      </w:rPr>
+    </w:lvl>
+    <w:lvl w:ilvl="2" w:tplc="04090005" w:tentative="1">
+      <w:start w:val="1"/>
+      <w:numFmt w:val="bullet"/>
+      <w:lvlText w:val=""/>
+      <w:lvlJc w:val="left"/>
+      <w:pPr>
+        <w:ind w:left="2160" w:hanging="360"/>
+      </w:pPr>
+      <w:rPr>
+        <w:rFonts w:ascii="Wingdings" w:hAnsi="Wingdings" w:hint="default"/>
+      </w:rPr>
+    </w:lvl>
+    <w:lvl w:ilvl="3" w:tplc="04090001" w:tentative="1">
+      <w:start w:val="1"/>
+      <w:numFmt w:val="bullet"/>
+      <w:lvlText w:val=""/>
+      <w:lvlJc w:val="left"/>
+      <w:pPr>
+        <w:ind w:left="2880" w:hanging="360"/>
+      </w:pPr>
+      <w:rPr>
+        <w:rFonts w:ascii="Symbol" w:hAnsi="Symbol" w:hint="default"/>
+      </w:rPr>
+    </w:lvl>
+    <w:lvl w:ilvl="4" w:tplc="04090003" w:tentative="1">
+      <w:start w:val="1"/>
+      <w:numFmt w:val="bullet"/>
+      <w:lvlText w:val="o"/>
+      <w:lvlJc w:val="left"/>
+      <w:pPr>
+        <w:ind w:left="3600" w:hanging="360"/>
+      </w:pPr>
+      <w:rPr>
+        <w:rFonts w:ascii="Courier New" w:hAnsi="Courier New" w:cs="Courier New" w:hint="default"/>
+      </w:rPr>
+    </w:lvl>
+    <w:lvl w:ilvl="5" w:tplc="04090005" w:tentative="1">
+      <w:start w:val="1"/>
+      <w:numFmt w:val="bullet"/>
+      <w:lvlText w:val=""/>
+      <w:lvlJc w:val="left"/>
+      <w:pPr>
+        <w:ind w:left="4320" w:hanging="360"/>
+      </w:pPr>
+      <w:rPr>
+        <w:rFonts w:ascii="Wingdings" w:hAnsi="Wingdings" w:hint="default"/>
+      </w:rPr>
+    </w:lvl>
+    <w:lvl w:ilvl="6" w:tplc="04090001" w:tentative="1">
+      <w:start w:val="1"/>
+      <w:numFmt w:val="bullet"/>
+      <w:lvlText w:val=""/>
+      <w:lvlJc w:val="left"/>
+      <w:pPr>
+        <w:ind w:left="5040" w:hanging="360"/>
+      </w:pPr>
+      <w:rPr>
+        <w:rFonts w:ascii="Symbol" w:hAnsi="Symbol" w:hint="default"/>
+      </w:rPr>
+    </w:lvl>
+    <w:lvl w:ilvl="7" w:tplc="04090003" w:tentative="1">
+      <w:start w:val="1"/>
+      <w:numFmt w:val="bullet"/>
+      <w:lvlText w:val="o"/>
+      <w:lvlJc w:val="left"/>
+      <w:pPr>
+        <w:ind w:left="5760" w:hanging="360"/>
+      </w:pPr>
+      <w:rPr>
+        <w:rFonts w:ascii="Courier New" w:hAnsi="Courier New" w:cs="Courier New" w:hint="default"/>
+      </w:rPr>
+    </w:lvl>
+    <w:lvl w:ilvl="8" w:tplc="04090005" w:tentative="1">
+      <w:start w:val="1"/>
+      <w:numFmt w:val="bullet"/>
+      <w:lvlText w:val=""/>
+      <w:lvlJc w:val="left"/>
+      <w:pPr>
+        <w:ind w:left="6480" w:hanging="360"/>
+      </w:pPr>
+      <w:rPr>
+        <w:rFonts w:ascii="Wingdings" w:hAnsi="Wingdings" w:hint="default"/>
+      </w:rPr>
+    </w:lvl>
+  </w:abstractNum>
+  <w:abstractNum w:abstractNumId="2" w15:restartNumberingAfterBreak="0">
+    <w:nsid w:val="0E00436C"/>
+    <w:multiLevelType w:val="hybridMultilevel"/>
+    <w:tmpl w:val="79345806"/>
+    <w:lvl w:ilvl="0" w:tplc="04090001">
+      <w:start w:val="1"/>
+      <w:numFmt w:val="bullet"/>
+      <w:lvlText w:val=""/>
+      <w:lvlJc w:val="left"/>
+      <w:pPr>
+        <w:ind w:left="1080" w:hanging="360"/>
+      </w:pPr>
+      <w:rPr>
+        <w:rFonts w:ascii="Symbol" w:hAnsi="Symbol" w:hint="default"/>
+      </w:rPr>
+    </w:lvl>
+    <w:lvl w:ilvl="1" w:tplc="04090003" w:tentative="1">
+      <w:start w:val="1"/>
+      <w:numFmt w:val="bullet"/>
+      <w:lvlText w:val="o"/>
+      <w:lvlJc w:val="left"/>
+      <w:pPr>
+        <w:ind w:left="1800" w:hanging="360"/>
+      </w:pPr>
+      <w:rPr>
+        <w:rFonts w:ascii="Courier New" w:hAnsi="Courier New" w:cs="Courier New" w:hint="default"/>
+      </w:rPr>
+    </w:lvl>
+    <w:lvl w:ilvl="2" w:tplc="04090005" w:tentative="1">
+      <w:start w:val="1"/>
+      <w:numFmt w:val="bullet"/>
+      <w:lvlText w:val=""/>
+      <w:lvlJc w:val="left"/>
+      <w:pPr>
+        <w:ind w:left="2520" w:hanging="360"/>
+      </w:pPr>
+      <w:rPr>
+        <w:rFonts w:ascii="Wingdings" w:hAnsi="Wingdings" w:hint="default"/>
+      </w:rPr>
+    </w:lvl>
+    <w:lvl w:ilvl="3" w:tplc="04090001" w:tentative="1">
+      <w:start w:val="1"/>
+      <w:numFmt w:val="bullet"/>
+      <w:lvlText w:val=""/>
+      <w:lvlJc w:val="left"/>
+      <w:pPr>
+        <w:ind w:left="3240" w:hanging="360"/>
+      </w:pPr>
+      <w:rPr>
+        <w:rFonts w:ascii="Symbol" w:hAnsi="Symbol" w:hint="default"/>
+      </w:rPr>
+    </w:lvl>
+    <w:lvl w:ilvl="4" w:tplc="04090003" w:tentative="1">
+      <w:start w:val="1"/>
+      <w:numFmt w:val="bullet"/>
+      <w:lvlText w:val="o"/>
+      <w:lvlJc w:val="left"/>
+      <w:pPr>
+        <w:ind w:left="3960" w:hanging="360"/>
+      </w:pPr>
+      <w:rPr>
+        <w:rFonts w:ascii="Courier New" w:hAnsi="Courier New" w:cs="Courier New" w:hint="default"/>
+      </w:rPr>
+    </w:lvl>
+    <w:lvl w:ilvl="5" w:tplc="04090005" w:tentative="1">
+      <w:start w:val="1"/>
+      <w:numFmt w:val="bullet"/>
+      <w:lvlText w:val=""/>
+      <w:lvlJc w:val="left"/>
+      <w:pPr>
+        <w:ind w:left="4680" w:hanging="360"/>
+      </w:pPr>
+      <w:rPr>
+        <w:rFonts w:ascii="Wingdings" w:hAnsi="Wingdings" w:hint="default"/>
+      </w:rPr>
+    </w:lvl>
+    <w:lvl w:ilvl="6" w:tplc="04090001" w:tentative="1">
+      <w:start w:val="1"/>
+      <w:numFmt w:val="bullet"/>
+      <w:lvlText w:val=""/>
+      <w:lvlJc w:val="left"/>
+      <w:pPr>
+        <w:ind w:left="5400" w:hanging="360"/>
+      </w:pPr>
+      <w:rPr>
+        <w:rFonts w:ascii="Symbol" w:hAnsi="Symbol" w:hint="default"/>
+      </w:rPr>
+    </w:lvl>
+    <w:lvl w:ilvl="7" w:tplc="04090003" w:tentative="1">
+      <w:start w:val="1"/>
+      <w:numFmt w:val="bullet"/>
+      <w:lvlText w:val="o"/>
+      <w:lvlJc w:val="left"/>
+      <w:pPr>
+        <w:ind w:left="6120" w:hanging="360"/>
+      </w:pPr>
+      <w:rPr>
+        <w:rFonts w:ascii="Courier New" w:hAnsi="Courier New" w:cs="Courier New" w:hint="default"/>
+      </w:rPr>
+    </w:lvl>
+    <w:lvl w:ilvl="8" w:tplc="04090005" w:tentative="1">
+      <w:start w:val="1"/>
+      <w:numFmt w:val="bullet"/>
+      <w:lvlText w:val=""/>
+      <w:lvlJc w:val="left"/>
+      <w:pPr>
+        <w:ind w:left="6840" w:hanging="360"/>
+      </w:pPr>
+      <w:rPr>
+        <w:rFonts w:ascii="Wingdings" w:hAnsi="Wingdings" w:hint="default"/>
+      </w:rPr>
+    </w:lvl>
+  </w:abstractNum>
+  <w:abstractNum w:abstractNumId="3" w15:restartNumberingAfterBreak="0">
     <w:nsid w:val="17A13A95"/>
     <w:multiLevelType w:val="multilevel"/>
     <w:tmpl w:val="3B3275C4"/>
@@ -6557,7 +7036,233 @@
       </w:rPr>
     </w:lvl>
   </w:abstractNum>
-  <w:abstractNum w:abstractNumId="2" w15:restartNumberingAfterBreak="0">
+  <w:abstractNum w:abstractNumId="4" w15:restartNumberingAfterBreak="0">
+    <w:nsid w:val="17D62EB4"/>
+    <w:multiLevelType w:val="hybridMultilevel"/>
+    <w:tmpl w:val="C8F63C1C"/>
+    <w:lvl w:ilvl="0" w:tplc="04090001">
+      <w:start w:val="1"/>
+      <w:numFmt w:val="bullet"/>
+      <w:lvlText w:val=""/>
+      <w:lvlJc w:val="left"/>
+      <w:pPr>
+        <w:ind w:left="1080" w:hanging="360"/>
+      </w:pPr>
+      <w:rPr>
+        <w:rFonts w:ascii="Symbol" w:hAnsi="Symbol" w:hint="default"/>
+      </w:rPr>
+    </w:lvl>
+    <w:lvl w:ilvl="1" w:tplc="04090003" w:tentative="1">
+      <w:start w:val="1"/>
+      <w:numFmt w:val="bullet"/>
+      <w:lvlText w:val="o"/>
+      <w:lvlJc w:val="left"/>
+      <w:pPr>
+        <w:ind w:left="1800" w:hanging="360"/>
+      </w:pPr>
+      <w:rPr>
+        <w:rFonts w:ascii="Courier New" w:hAnsi="Courier New" w:cs="Courier New" w:hint="default"/>
+      </w:rPr>
+    </w:lvl>
+    <w:lvl w:ilvl="2" w:tplc="04090005" w:tentative="1">
+      <w:start w:val="1"/>
+      <w:numFmt w:val="bullet"/>
+      <w:lvlText w:val=""/>
+      <w:lvlJc w:val="left"/>
+      <w:pPr>
+        <w:ind w:left="2520" w:hanging="360"/>
+      </w:pPr>
+      <w:rPr>
+        <w:rFonts w:ascii="Wingdings" w:hAnsi="Wingdings" w:hint="default"/>
+      </w:rPr>
+    </w:lvl>
+    <w:lvl w:ilvl="3" w:tplc="04090001" w:tentative="1">
+      <w:start w:val="1"/>
+      <w:numFmt w:val="bullet"/>
+      <w:lvlText w:val=""/>
+      <w:lvlJc w:val="left"/>
+      <w:pPr>
+        <w:ind w:left="3240" w:hanging="360"/>
+      </w:pPr>
+      <w:rPr>
+        <w:rFonts w:ascii="Symbol" w:hAnsi="Symbol" w:hint="default"/>
+      </w:rPr>
+    </w:lvl>
+    <w:lvl w:ilvl="4" w:tplc="04090003" w:tentative="1">
+      <w:start w:val="1"/>
+      <w:numFmt w:val="bullet"/>
+      <w:lvlText w:val="o"/>
+      <w:lvlJc w:val="left"/>
+      <w:pPr>
+        <w:ind w:left="3960" w:hanging="360"/>
+      </w:pPr>
+      <w:rPr>
+        <w:rFonts w:ascii="Courier New" w:hAnsi="Courier New" w:cs="Courier New" w:hint="default"/>
+      </w:rPr>
+    </w:lvl>
+    <w:lvl w:ilvl="5" w:tplc="04090005" w:tentative="1">
+      <w:start w:val="1"/>
+      <w:numFmt w:val="bullet"/>
+      <w:lvlText w:val=""/>
+      <w:lvlJc w:val="left"/>
+      <w:pPr>
+        <w:ind w:left="4680" w:hanging="360"/>
+      </w:pPr>
+      <w:rPr>
+        <w:rFonts w:ascii="Wingdings" w:hAnsi="Wingdings" w:hint="default"/>
+      </w:rPr>
+    </w:lvl>
+    <w:lvl w:ilvl="6" w:tplc="04090001" w:tentative="1">
+      <w:start w:val="1"/>
+      <w:numFmt w:val="bullet"/>
+      <w:lvlText w:val=""/>
+      <w:lvlJc w:val="left"/>
+      <w:pPr>
+        <w:ind w:left="5400" w:hanging="360"/>
+      </w:pPr>
+      <w:rPr>
+        <w:rFonts w:ascii="Symbol" w:hAnsi="Symbol" w:hint="default"/>
+      </w:rPr>
+    </w:lvl>
+    <w:lvl w:ilvl="7" w:tplc="04090003" w:tentative="1">
+      <w:start w:val="1"/>
+      <w:numFmt w:val="bullet"/>
+      <w:lvlText w:val="o"/>
+      <w:lvlJc w:val="left"/>
+      <w:pPr>
+        <w:ind w:left="6120" w:hanging="360"/>
+      </w:pPr>
+      <w:rPr>
+        <w:rFonts w:ascii="Courier New" w:hAnsi="Courier New" w:cs="Courier New" w:hint="default"/>
+      </w:rPr>
+    </w:lvl>
+    <w:lvl w:ilvl="8" w:tplc="04090005" w:tentative="1">
+      <w:start w:val="1"/>
+      <w:numFmt w:val="bullet"/>
+      <w:lvlText w:val=""/>
+      <w:lvlJc w:val="left"/>
+      <w:pPr>
+        <w:ind w:left="6840" w:hanging="360"/>
+      </w:pPr>
+      <w:rPr>
+        <w:rFonts w:ascii="Wingdings" w:hAnsi="Wingdings" w:hint="default"/>
+      </w:rPr>
+    </w:lvl>
+  </w:abstractNum>
+  <w:abstractNum w:abstractNumId="5" w15:restartNumberingAfterBreak="0">
+    <w:nsid w:val="1CC61470"/>
+    <w:multiLevelType w:val="hybridMultilevel"/>
+    <w:tmpl w:val="7514F8E0"/>
+    <w:lvl w:ilvl="0" w:tplc="F712FA9A">
+      <w:start w:val="1"/>
+      <w:numFmt w:val="bullet"/>
+      <w:lvlText w:val="-"/>
+      <w:lvlJc w:val="left"/>
+      <w:pPr>
+        <w:ind w:left="720" w:hanging="360"/>
+      </w:pPr>
+      <w:rPr>
+        <w:rFonts w:ascii="Wandohope" w:eastAsia="Wandohope" w:hAnsi="Wandohope" w:hint="eastAsia"/>
+      </w:rPr>
+    </w:lvl>
+    <w:lvl w:ilvl="1" w:tplc="04090003" w:tentative="1">
+      <w:start w:val="1"/>
+      <w:numFmt w:val="bullet"/>
+      <w:lvlText w:val="o"/>
+      <w:lvlJc w:val="left"/>
+      <w:pPr>
+        <w:ind w:left="1440" w:hanging="360"/>
+      </w:pPr>
+      <w:rPr>
+        <w:rFonts w:ascii="Courier New" w:hAnsi="Courier New" w:cs="Courier New" w:hint="default"/>
+      </w:rPr>
+    </w:lvl>
+    <w:lvl w:ilvl="2" w:tplc="04090005" w:tentative="1">
+      <w:start w:val="1"/>
+      <w:numFmt w:val="bullet"/>
+      <w:lvlText w:val=""/>
+      <w:lvlJc w:val="left"/>
+      <w:pPr>
+        <w:ind w:left="2160" w:hanging="360"/>
+      </w:pPr>
+      <w:rPr>
+        <w:rFonts w:ascii="Wingdings" w:hAnsi="Wingdings" w:hint="default"/>
+      </w:rPr>
+    </w:lvl>
+    <w:lvl w:ilvl="3" w:tplc="04090001" w:tentative="1">
+      <w:start w:val="1"/>
+      <w:numFmt w:val="bullet"/>
+      <w:lvlText w:val=""/>
+      <w:lvlJc w:val="left"/>
+      <w:pPr>
+        <w:ind w:left="2880" w:hanging="360"/>
+      </w:pPr>
+      <w:rPr>
+        <w:rFonts w:ascii="Symbol" w:hAnsi="Symbol" w:hint="default"/>
+      </w:rPr>
+    </w:lvl>
+    <w:lvl w:ilvl="4" w:tplc="04090003" w:tentative="1">
+      <w:start w:val="1"/>
+      <w:numFmt w:val="bullet"/>
+      <w:lvlText w:val="o"/>
+      <w:lvlJc w:val="left"/>
+      <w:pPr>
+        <w:ind w:left="3600" w:hanging="360"/>
+      </w:pPr>
+      <w:rPr>
+        <w:rFonts w:ascii="Courier New" w:hAnsi="Courier New" w:cs="Courier New" w:hint="default"/>
+      </w:rPr>
+    </w:lvl>
+    <w:lvl w:ilvl="5" w:tplc="04090005" w:tentative="1">
+      <w:start w:val="1"/>
+      <w:numFmt w:val="bullet"/>
+      <w:lvlText w:val=""/>
+      <w:lvlJc w:val="left"/>
+      <w:pPr>
+        <w:ind w:left="4320" w:hanging="360"/>
+      </w:pPr>
+      <w:rPr>
+        <w:rFonts w:ascii="Wingdings" w:hAnsi="Wingdings" w:hint="default"/>
+      </w:rPr>
+    </w:lvl>
+    <w:lvl w:ilvl="6" w:tplc="04090001" w:tentative="1">
+      <w:start w:val="1"/>
+      <w:numFmt w:val="bullet"/>
+      <w:lvlText w:val=""/>
+      <w:lvlJc w:val="left"/>
+      <w:pPr>
+        <w:ind w:left="5040" w:hanging="360"/>
+      </w:pPr>
+      <w:rPr>
+        <w:rFonts w:ascii="Symbol" w:hAnsi="Symbol" w:hint="default"/>
+      </w:rPr>
+    </w:lvl>
+    <w:lvl w:ilvl="7" w:tplc="04090003" w:tentative="1">
+      <w:start w:val="1"/>
+      <w:numFmt w:val="bullet"/>
+      <w:lvlText w:val="o"/>
+      <w:lvlJc w:val="left"/>
+      <w:pPr>
+        <w:ind w:left="5760" w:hanging="360"/>
+      </w:pPr>
+      <w:rPr>
+        <w:rFonts w:ascii="Courier New" w:hAnsi="Courier New" w:cs="Courier New" w:hint="default"/>
+      </w:rPr>
+    </w:lvl>
+    <w:lvl w:ilvl="8" w:tplc="04090005" w:tentative="1">
+      <w:start w:val="1"/>
+      <w:numFmt w:val="bullet"/>
+      <w:lvlText w:val=""/>
+      <w:lvlJc w:val="left"/>
+      <w:pPr>
+        <w:ind w:left="6480" w:hanging="360"/>
+      </w:pPr>
+      <w:rPr>
+        <w:rFonts w:ascii="Wingdings" w:hAnsi="Wingdings" w:hint="default"/>
+      </w:rPr>
+    </w:lvl>
+  </w:abstractNum>
+  <w:abstractNum w:abstractNumId="6" w15:restartNumberingAfterBreak="0">
     <w:nsid w:val="2BFF1ACE"/>
     <w:multiLevelType w:val="multilevel"/>
     <w:tmpl w:val="046E5064"/>
@@ -6706,7 +7411,233 @@
       </w:rPr>
     </w:lvl>
   </w:abstractNum>
-  <w:abstractNum w:abstractNumId="3" w15:restartNumberingAfterBreak="0">
+  <w:abstractNum w:abstractNumId="7" w15:restartNumberingAfterBreak="0">
+    <w:nsid w:val="42D11A88"/>
+    <w:multiLevelType w:val="hybridMultilevel"/>
+    <w:tmpl w:val="20D4B020"/>
+    <w:lvl w:ilvl="0" w:tplc="04090001">
+      <w:start w:val="1"/>
+      <w:numFmt w:val="bullet"/>
+      <w:lvlText w:val=""/>
+      <w:lvlJc w:val="left"/>
+      <w:pPr>
+        <w:ind w:left="1080" w:hanging="360"/>
+      </w:pPr>
+      <w:rPr>
+        <w:rFonts w:ascii="Symbol" w:hAnsi="Symbol" w:hint="default"/>
+      </w:rPr>
+    </w:lvl>
+    <w:lvl w:ilvl="1" w:tplc="04090003" w:tentative="1">
+      <w:start w:val="1"/>
+      <w:numFmt w:val="bullet"/>
+      <w:lvlText w:val="o"/>
+      <w:lvlJc w:val="left"/>
+      <w:pPr>
+        <w:ind w:left="1800" w:hanging="360"/>
+      </w:pPr>
+      <w:rPr>
+        <w:rFonts w:ascii="Courier New" w:hAnsi="Courier New" w:cs="Courier New" w:hint="default"/>
+      </w:rPr>
+    </w:lvl>
+    <w:lvl w:ilvl="2" w:tplc="04090005" w:tentative="1">
+      <w:start w:val="1"/>
+      <w:numFmt w:val="bullet"/>
+      <w:lvlText w:val=""/>
+      <w:lvlJc w:val="left"/>
+      <w:pPr>
+        <w:ind w:left="2520" w:hanging="360"/>
+      </w:pPr>
+      <w:rPr>
+        <w:rFonts w:ascii="Wingdings" w:hAnsi="Wingdings" w:hint="default"/>
+      </w:rPr>
+    </w:lvl>
+    <w:lvl w:ilvl="3" w:tplc="04090001" w:tentative="1">
+      <w:start w:val="1"/>
+      <w:numFmt w:val="bullet"/>
+      <w:lvlText w:val=""/>
+      <w:lvlJc w:val="left"/>
+      <w:pPr>
+        <w:ind w:left="3240" w:hanging="360"/>
+      </w:pPr>
+      <w:rPr>
+        <w:rFonts w:ascii="Symbol" w:hAnsi="Symbol" w:hint="default"/>
+      </w:rPr>
+    </w:lvl>
+    <w:lvl w:ilvl="4" w:tplc="04090003" w:tentative="1">
+      <w:start w:val="1"/>
+      <w:numFmt w:val="bullet"/>
+      <w:lvlText w:val="o"/>
+      <w:lvlJc w:val="left"/>
+      <w:pPr>
+        <w:ind w:left="3960" w:hanging="360"/>
+      </w:pPr>
+      <w:rPr>
+        <w:rFonts w:ascii="Courier New" w:hAnsi="Courier New" w:cs="Courier New" w:hint="default"/>
+      </w:rPr>
+    </w:lvl>
+    <w:lvl w:ilvl="5" w:tplc="04090005" w:tentative="1">
+      <w:start w:val="1"/>
+      <w:numFmt w:val="bullet"/>
+      <w:lvlText w:val=""/>
+      <w:lvlJc w:val="left"/>
+      <w:pPr>
+        <w:ind w:left="4680" w:hanging="360"/>
+      </w:pPr>
+      <w:rPr>
+        <w:rFonts w:ascii="Wingdings" w:hAnsi="Wingdings" w:hint="default"/>
+      </w:rPr>
+    </w:lvl>
+    <w:lvl w:ilvl="6" w:tplc="04090001" w:tentative="1">
+      <w:start w:val="1"/>
+      <w:numFmt w:val="bullet"/>
+      <w:lvlText w:val=""/>
+      <w:lvlJc w:val="left"/>
+      <w:pPr>
+        <w:ind w:left="5400" w:hanging="360"/>
+      </w:pPr>
+      <w:rPr>
+        <w:rFonts w:ascii="Symbol" w:hAnsi="Symbol" w:hint="default"/>
+      </w:rPr>
+    </w:lvl>
+    <w:lvl w:ilvl="7" w:tplc="04090003" w:tentative="1">
+      <w:start w:val="1"/>
+      <w:numFmt w:val="bullet"/>
+      <w:lvlText w:val="o"/>
+      <w:lvlJc w:val="left"/>
+      <w:pPr>
+        <w:ind w:left="6120" w:hanging="360"/>
+      </w:pPr>
+      <w:rPr>
+        <w:rFonts w:ascii="Courier New" w:hAnsi="Courier New" w:cs="Courier New" w:hint="default"/>
+      </w:rPr>
+    </w:lvl>
+    <w:lvl w:ilvl="8" w:tplc="04090005" w:tentative="1">
+      <w:start w:val="1"/>
+      <w:numFmt w:val="bullet"/>
+      <w:lvlText w:val=""/>
+      <w:lvlJc w:val="left"/>
+      <w:pPr>
+        <w:ind w:left="6840" w:hanging="360"/>
+      </w:pPr>
+      <w:rPr>
+        <w:rFonts w:ascii="Wingdings" w:hAnsi="Wingdings" w:hint="default"/>
+      </w:rPr>
+    </w:lvl>
+  </w:abstractNum>
+  <w:abstractNum w:abstractNumId="8" w15:restartNumberingAfterBreak="0">
+    <w:nsid w:val="49D947C9"/>
+    <w:multiLevelType w:val="hybridMultilevel"/>
+    <w:tmpl w:val="816A4520"/>
+    <w:lvl w:ilvl="0" w:tplc="04090001">
+      <w:start w:val="1"/>
+      <w:numFmt w:val="bullet"/>
+      <w:lvlText w:val=""/>
+      <w:lvlJc w:val="left"/>
+      <w:pPr>
+        <w:ind w:left="1080" w:hanging="360"/>
+      </w:pPr>
+      <w:rPr>
+        <w:rFonts w:ascii="Symbol" w:hAnsi="Symbol" w:hint="default"/>
+      </w:rPr>
+    </w:lvl>
+    <w:lvl w:ilvl="1" w:tplc="04090003" w:tentative="1">
+      <w:start w:val="1"/>
+      <w:numFmt w:val="bullet"/>
+      <w:lvlText w:val="o"/>
+      <w:lvlJc w:val="left"/>
+      <w:pPr>
+        <w:ind w:left="1800" w:hanging="360"/>
+      </w:pPr>
+      <w:rPr>
+        <w:rFonts w:ascii="Courier New" w:hAnsi="Courier New" w:cs="Courier New" w:hint="default"/>
+      </w:rPr>
+    </w:lvl>
+    <w:lvl w:ilvl="2" w:tplc="04090005" w:tentative="1">
+      <w:start w:val="1"/>
+      <w:numFmt w:val="bullet"/>
+      <w:lvlText w:val=""/>
+      <w:lvlJc w:val="left"/>
+      <w:pPr>
+        <w:ind w:left="2520" w:hanging="360"/>
+      </w:pPr>
+      <w:rPr>
+        <w:rFonts w:ascii="Wingdings" w:hAnsi="Wingdings" w:hint="default"/>
+      </w:rPr>
+    </w:lvl>
+    <w:lvl w:ilvl="3" w:tplc="04090001" w:tentative="1">
+      <w:start w:val="1"/>
+      <w:numFmt w:val="bullet"/>
+      <w:lvlText w:val=""/>
+      <w:lvlJc w:val="left"/>
+      <w:pPr>
+        <w:ind w:left="3240" w:hanging="360"/>
+      </w:pPr>
+      <w:rPr>
+        <w:rFonts w:ascii="Symbol" w:hAnsi="Symbol" w:hint="default"/>
+      </w:rPr>
+    </w:lvl>
+    <w:lvl w:ilvl="4" w:tplc="04090003" w:tentative="1">
+      <w:start w:val="1"/>
+      <w:numFmt w:val="bullet"/>
+      <w:lvlText w:val="o"/>
+      <w:lvlJc w:val="left"/>
+      <w:pPr>
+        <w:ind w:left="3960" w:hanging="360"/>
+      </w:pPr>
+      <w:rPr>
+        <w:rFonts w:ascii="Courier New" w:hAnsi="Courier New" w:cs="Courier New" w:hint="default"/>
+      </w:rPr>
+    </w:lvl>
+    <w:lvl w:ilvl="5" w:tplc="04090005" w:tentative="1">
+      <w:start w:val="1"/>
+      <w:numFmt w:val="bullet"/>
+      <w:lvlText w:val=""/>
+      <w:lvlJc w:val="left"/>
+      <w:pPr>
+        <w:ind w:left="4680" w:hanging="360"/>
+      </w:pPr>
+      <w:rPr>
+        <w:rFonts w:ascii="Wingdings" w:hAnsi="Wingdings" w:hint="default"/>
+      </w:rPr>
+    </w:lvl>
+    <w:lvl w:ilvl="6" w:tplc="04090001" w:tentative="1">
+      <w:start w:val="1"/>
+      <w:numFmt w:val="bullet"/>
+      <w:lvlText w:val=""/>
+      <w:lvlJc w:val="left"/>
+      <w:pPr>
+        <w:ind w:left="5400" w:hanging="360"/>
+      </w:pPr>
+      <w:rPr>
+        <w:rFonts w:ascii="Symbol" w:hAnsi="Symbol" w:hint="default"/>
+      </w:rPr>
+    </w:lvl>
+    <w:lvl w:ilvl="7" w:tplc="04090003" w:tentative="1">
+      <w:start w:val="1"/>
+      <w:numFmt w:val="bullet"/>
+      <w:lvlText w:val="o"/>
+      <w:lvlJc w:val="left"/>
+      <w:pPr>
+        <w:ind w:left="6120" w:hanging="360"/>
+      </w:pPr>
+      <w:rPr>
+        <w:rFonts w:ascii="Courier New" w:hAnsi="Courier New" w:cs="Courier New" w:hint="default"/>
+      </w:rPr>
+    </w:lvl>
+    <w:lvl w:ilvl="8" w:tplc="04090005" w:tentative="1">
+      <w:start w:val="1"/>
+      <w:numFmt w:val="bullet"/>
+      <w:lvlText w:val=""/>
+      <w:lvlJc w:val="left"/>
+      <w:pPr>
+        <w:ind w:left="6840" w:hanging="360"/>
+      </w:pPr>
+      <w:rPr>
+        <w:rFonts w:ascii="Wingdings" w:hAnsi="Wingdings" w:hint="default"/>
+      </w:rPr>
+    </w:lvl>
+  </w:abstractNum>
+  <w:abstractNum w:abstractNumId="9" w15:restartNumberingAfterBreak="0">
     <w:nsid w:val="4FAB1472"/>
     <w:multiLevelType w:val="multilevel"/>
     <w:tmpl w:val="04569C3E"/>
@@ -6855,7 +7786,7 @@
       </w:rPr>
     </w:lvl>
   </w:abstractNum>
-  <w:abstractNum w:abstractNumId="4" w15:restartNumberingAfterBreak="0">
+  <w:abstractNum w:abstractNumId="10" w15:restartNumberingAfterBreak="0">
     <w:nsid w:val="4FAB1E84"/>
     <w:multiLevelType w:val="multilevel"/>
     <w:tmpl w:val="B596DC90"/>
@@ -7004,7 +7935,7 @@
       </w:rPr>
     </w:lvl>
   </w:abstractNum>
-  <w:abstractNum w:abstractNumId="5" w15:restartNumberingAfterBreak="0">
+  <w:abstractNum w:abstractNumId="11" w15:restartNumberingAfterBreak="0">
     <w:nsid w:val="75D252AF"/>
     <w:multiLevelType w:val="multilevel"/>
     <w:tmpl w:val="9E20AE8E"/>
@@ -7153,7 +8084,120 @@
       </w:rPr>
     </w:lvl>
   </w:abstractNum>
-  <w:abstractNum w:abstractNumId="6" w15:restartNumberingAfterBreak="0">
+  <w:abstractNum w:abstractNumId="12" w15:restartNumberingAfterBreak="0">
+    <w:nsid w:val="77513306"/>
+    <w:multiLevelType w:val="hybridMultilevel"/>
+    <w:tmpl w:val="612099AC"/>
+    <w:lvl w:ilvl="0" w:tplc="04090001">
+      <w:start w:val="1"/>
+      <w:numFmt w:val="bullet"/>
+      <w:lvlText w:val=""/>
+      <w:lvlJc w:val="left"/>
+      <w:pPr>
+        <w:ind w:left="1080" w:hanging="360"/>
+      </w:pPr>
+      <w:rPr>
+        <w:rFonts w:ascii="Symbol" w:hAnsi="Symbol" w:hint="default"/>
+      </w:rPr>
+    </w:lvl>
+    <w:lvl w:ilvl="1" w:tplc="04090003" w:tentative="1">
+      <w:start w:val="1"/>
+      <w:numFmt w:val="bullet"/>
+      <w:lvlText w:val="o"/>
+      <w:lvlJc w:val="left"/>
+      <w:pPr>
+        <w:ind w:left="1800" w:hanging="360"/>
+      </w:pPr>
+      <w:rPr>
+        <w:rFonts w:ascii="Courier New" w:hAnsi="Courier New" w:cs="Courier New" w:hint="default"/>
+      </w:rPr>
+    </w:lvl>
+    <w:lvl w:ilvl="2" w:tplc="04090005" w:tentative="1">
+      <w:start w:val="1"/>
+      <w:numFmt w:val="bullet"/>
+      <w:lvlText w:val=""/>
+      <w:lvlJc w:val="left"/>
+      <w:pPr>
+        <w:ind w:left="2520" w:hanging="360"/>
+      </w:pPr>
+      <w:rPr>
+        <w:rFonts w:ascii="Wingdings" w:hAnsi="Wingdings" w:hint="default"/>
+      </w:rPr>
+    </w:lvl>
+    <w:lvl w:ilvl="3" w:tplc="04090001" w:tentative="1">
+      <w:start w:val="1"/>
+      <w:numFmt w:val="bullet"/>
+      <w:lvlText w:val=""/>
+      <w:lvlJc w:val="left"/>
+      <w:pPr>
+        <w:ind w:left="3240" w:hanging="360"/>
+      </w:pPr>
+      <w:rPr>
+        <w:rFonts w:ascii="Symbol" w:hAnsi="Symbol" w:hint="default"/>
+      </w:rPr>
+    </w:lvl>
+    <w:lvl w:ilvl="4" w:tplc="04090003" w:tentative="1">
+      <w:start w:val="1"/>
+      <w:numFmt w:val="bullet"/>
+      <w:lvlText w:val="o"/>
+      <w:lvlJc w:val="left"/>
+      <w:pPr>
+        <w:ind w:left="3960" w:hanging="360"/>
+      </w:pPr>
+      <w:rPr>
+        <w:rFonts w:ascii="Courier New" w:hAnsi="Courier New" w:cs="Courier New" w:hint="default"/>
+      </w:rPr>
+    </w:lvl>
+    <w:lvl w:ilvl="5" w:tplc="04090005" w:tentative="1">
+      <w:start w:val="1"/>
+      <w:numFmt w:val="bullet"/>
+      <w:lvlText w:val=""/>
+      <w:lvlJc w:val="left"/>
+      <w:pPr>
+        <w:ind w:left="4680" w:hanging="360"/>
+      </w:pPr>
+      <w:rPr>
+        <w:rFonts w:ascii="Wingdings" w:hAnsi="Wingdings" w:hint="default"/>
+      </w:rPr>
+    </w:lvl>
+    <w:lvl w:ilvl="6" w:tplc="04090001" w:tentative="1">
+      <w:start w:val="1"/>
+      <w:numFmt w:val="bullet"/>
+      <w:lvlText w:val=""/>
+      <w:lvlJc w:val="left"/>
+      <w:pPr>
+        <w:ind w:left="5400" w:hanging="360"/>
+      </w:pPr>
+      <w:rPr>
+        <w:rFonts w:ascii="Symbol" w:hAnsi="Symbol" w:hint="default"/>
+      </w:rPr>
+    </w:lvl>
+    <w:lvl w:ilvl="7" w:tplc="04090003" w:tentative="1">
+      <w:start w:val="1"/>
+      <w:numFmt w:val="bullet"/>
+      <w:lvlText w:val="o"/>
+      <w:lvlJc w:val="left"/>
+      <w:pPr>
+        <w:ind w:left="6120" w:hanging="360"/>
+      </w:pPr>
+      <w:rPr>
+        <w:rFonts w:ascii="Courier New" w:hAnsi="Courier New" w:cs="Courier New" w:hint="default"/>
+      </w:rPr>
+    </w:lvl>
+    <w:lvl w:ilvl="8" w:tplc="04090005" w:tentative="1">
+      <w:start w:val="1"/>
+      <w:numFmt w:val="bullet"/>
+      <w:lvlText w:val=""/>
+      <w:lvlJc w:val="left"/>
+      <w:pPr>
+        <w:ind w:left="6840" w:hanging="360"/>
+      </w:pPr>
+      <w:rPr>
+        <w:rFonts w:ascii="Wingdings" w:hAnsi="Wingdings" w:hint="default"/>
+      </w:rPr>
+    </w:lvl>
+  </w:abstractNum>
+  <w:abstractNum w:abstractNumId="13" w15:restartNumberingAfterBreak="0">
     <w:nsid w:val="7F6D4BED"/>
     <w:multiLevelType w:val="multilevel"/>
     <w:tmpl w:val="EB2A4B52"/>
@@ -7303,25 +8347,46 @@
     </w:lvl>
   </w:abstractNum>
   <w:num w:numId="1" w16cid:durableId="117651727">
-    <w:abstractNumId w:val="5"/>
+    <w:abstractNumId w:val="11"/>
   </w:num>
   <w:num w:numId="2" w16cid:durableId="957175016">
-    <w:abstractNumId w:val="2"/>
+    <w:abstractNumId w:val="6"/>
   </w:num>
   <w:num w:numId="3" w16cid:durableId="1001815283">
-    <w:abstractNumId w:val="1"/>
+    <w:abstractNumId w:val="3"/>
   </w:num>
   <w:num w:numId="4" w16cid:durableId="767585540">
-    <w:abstractNumId w:val="3"/>
+    <w:abstractNumId w:val="9"/>
   </w:num>
   <w:num w:numId="5" w16cid:durableId="2058697030">
-    <w:abstractNumId w:val="6"/>
+    <w:abstractNumId w:val="13"/>
   </w:num>
   <w:num w:numId="6" w16cid:durableId="128013269">
     <w:abstractNumId w:val="0"/>
   </w:num>
   <w:num w:numId="7" w16cid:durableId="122042539">
+    <w:abstractNumId w:val="10"/>
+  </w:num>
+  <w:num w:numId="8" w16cid:durableId="535234850">
+    <w:abstractNumId w:val="5"/>
+  </w:num>
+  <w:num w:numId="9" w16cid:durableId="207033306">
+    <w:abstractNumId w:val="8"/>
+  </w:num>
+  <w:num w:numId="10" w16cid:durableId="1234193115">
+    <w:abstractNumId w:val="12"/>
+  </w:num>
+  <w:num w:numId="11" w16cid:durableId="1843399418">
+    <w:abstractNumId w:val="7"/>
+  </w:num>
+  <w:num w:numId="12" w16cid:durableId="1212763608">
     <w:abstractNumId w:val="4"/>
+  </w:num>
+  <w:num w:numId="13" w16cid:durableId="1112088414">
+    <w:abstractNumId w:val="2"/>
+  </w:num>
+  <w:num w:numId="14" w16cid:durableId="1792284569">
+    <w:abstractNumId w:val="1"/>
   </w:num>
 </w:numbering>
 </file>
@@ -7933,6 +8998,7 @@
   <w:style w:type="character" w:default="1" w:styleId="DefaultParagraphFont">
     <w:name w:val="Default Paragraph Font"/>
     <w:uiPriority w:val="1"/>
+    <w:semiHidden/>
     <w:unhideWhenUsed/>
   </w:style>
   <w:style w:type="table" w:default="1" w:styleId="TableNormal">

</xml_diff>

<commit_message>
docs: refix week 1 analysis documents after review
</commit_message>
<xml_diff>
--- a/DOCX/TaiLieuPhanTich/01_Pham_vi_de_tai.docx
+++ b/DOCX/TaiLieuPhanTich/01_Pham_vi_de_tai.docx
@@ -137,6 +137,11 @@
     </w:p>
     <w:p>
       <w:pPr>
+        <w:pStyle w:val="ListParagraph"/>
+        <w:numPr>
+          <w:ilvl w:val="0"/>
+          <w:numId w:val="20"/>
+        </w:numPr>
         <w:spacing w:after="0" w:line="360" w:lineRule="auto"/>
         <w:rPr>
           <w:rFonts w:cs="Times New Roman"/>
@@ -176,7 +181,7 @@
         <w:pStyle w:val="ListParagraph"/>
         <w:numPr>
           <w:ilvl w:val="0"/>
-          <w:numId w:val="11"/>
+          <w:numId w:val="20"/>
         </w:numPr>
         <w:spacing w:after="0" w:line="360" w:lineRule="auto"/>
         <w:rPr>
@@ -199,7 +204,7 @@
         <w:pStyle w:val="ListParagraph"/>
         <w:numPr>
           <w:ilvl w:val="0"/>
-          <w:numId w:val="11"/>
+          <w:numId w:val="20"/>
         </w:numPr>
         <w:spacing w:after="0" w:line="360" w:lineRule="auto"/>
         <w:rPr>
@@ -219,6 +224,11 @@
     </w:p>
     <w:p>
       <w:pPr>
+        <w:pStyle w:val="ListParagraph"/>
+        <w:numPr>
+          <w:ilvl w:val="0"/>
+          <w:numId w:val="20"/>
+        </w:numPr>
         <w:spacing w:after="0" w:line="360" w:lineRule="auto"/>
         <w:rPr>
           <w:rFonts w:cs="Times New Roman"/>
@@ -258,7 +268,7 @@
         <w:pStyle w:val="ListParagraph"/>
         <w:numPr>
           <w:ilvl w:val="0"/>
-          <w:numId w:val="11"/>
+          <w:numId w:val="20"/>
         </w:numPr>
         <w:spacing w:after="0" w:line="360" w:lineRule="auto"/>
         <w:rPr>
@@ -281,7 +291,7 @@
         <w:pStyle w:val="ListParagraph"/>
         <w:numPr>
           <w:ilvl w:val="0"/>
-          <w:numId w:val="11"/>
+          <w:numId w:val="20"/>
         </w:numPr>
         <w:spacing w:after="0" w:line="360" w:lineRule="auto"/>
         <w:rPr>
@@ -301,6 +311,11 @@
     </w:p>
     <w:p>
       <w:pPr>
+        <w:pStyle w:val="ListParagraph"/>
+        <w:numPr>
+          <w:ilvl w:val="0"/>
+          <w:numId w:val="20"/>
+        </w:numPr>
         <w:spacing w:after="0" w:line="360" w:lineRule="auto"/>
         <w:rPr>
           <w:rFonts w:cs="Times New Roman"/>
@@ -340,7 +355,7 @@
         <w:pStyle w:val="ListParagraph"/>
         <w:numPr>
           <w:ilvl w:val="0"/>
-          <w:numId w:val="11"/>
+          <w:numId w:val="20"/>
         </w:numPr>
         <w:spacing w:after="0" w:line="360" w:lineRule="auto"/>
         <w:rPr>
@@ -1125,7 +1140,39 @@
           <w:sz w:val="26"/>
           <w:szCs w:val="26"/>
         </w:rPr>
-        <w:t xml:space="preserve">Đóng và mở lại ticket theo business rules. </w:t>
+        <w:t xml:space="preserve">Đóng và mở lại ticket theo </w:t>
+      </w:r>
+      <w:r>
+        <w:rPr>
+          <w:rFonts w:cs="Times New Roman"/>
+          <w:sz w:val="26"/>
+          <w:szCs w:val="26"/>
+        </w:rPr>
+        <w:t>B</w:t>
+      </w:r>
+      <w:r>
+        <w:rPr>
+          <w:rFonts w:cs="Times New Roman"/>
+          <w:sz w:val="26"/>
+          <w:szCs w:val="26"/>
+        </w:rPr>
+        <w:t xml:space="preserve">usiness </w:t>
+      </w:r>
+      <w:r>
+        <w:rPr>
+          <w:rFonts w:cs="Times New Roman"/>
+          <w:sz w:val="26"/>
+          <w:szCs w:val="26"/>
+        </w:rPr>
+        <w:t>R</w:t>
+      </w:r>
+      <w:r>
+        <w:rPr>
+          <w:rFonts w:cs="Times New Roman"/>
+          <w:sz w:val="26"/>
+          <w:szCs w:val="26"/>
+        </w:rPr>
+        <w:t xml:space="preserve">ules. </w:t>
       </w:r>
     </w:p>
     <w:p>
@@ -3378,6 +3425,119 @@
     </w:lvl>
   </w:abstractNum>
   <w:abstractNum w:abstractNumId="13" w15:restartNumberingAfterBreak="0">
+    <w:nsid w:val="60EC1514"/>
+    <w:multiLevelType w:val="hybridMultilevel"/>
+    <w:tmpl w:val="9D148BDE"/>
+    <w:lvl w:ilvl="0" w:tplc="04090001">
+      <w:start w:val="1"/>
+      <w:numFmt w:val="bullet"/>
+      <w:lvlText w:val=""/>
+      <w:lvlJc w:val="left"/>
+      <w:pPr>
+        <w:ind w:left="720" w:hanging="360"/>
+      </w:pPr>
+      <w:rPr>
+        <w:rFonts w:ascii="Symbol" w:hAnsi="Symbol" w:hint="default"/>
+      </w:rPr>
+    </w:lvl>
+    <w:lvl w:ilvl="1" w:tplc="04090003" w:tentative="1">
+      <w:start w:val="1"/>
+      <w:numFmt w:val="bullet"/>
+      <w:lvlText w:val="o"/>
+      <w:lvlJc w:val="left"/>
+      <w:pPr>
+        <w:ind w:left="1440" w:hanging="360"/>
+      </w:pPr>
+      <w:rPr>
+        <w:rFonts w:ascii="Courier New" w:hAnsi="Courier New" w:cs="Courier New" w:hint="default"/>
+      </w:rPr>
+    </w:lvl>
+    <w:lvl w:ilvl="2" w:tplc="04090005" w:tentative="1">
+      <w:start w:val="1"/>
+      <w:numFmt w:val="bullet"/>
+      <w:lvlText w:val=""/>
+      <w:lvlJc w:val="left"/>
+      <w:pPr>
+        <w:ind w:left="2160" w:hanging="360"/>
+      </w:pPr>
+      <w:rPr>
+        <w:rFonts w:ascii="Wingdings" w:hAnsi="Wingdings" w:hint="default"/>
+      </w:rPr>
+    </w:lvl>
+    <w:lvl w:ilvl="3" w:tplc="04090001" w:tentative="1">
+      <w:start w:val="1"/>
+      <w:numFmt w:val="bullet"/>
+      <w:lvlText w:val=""/>
+      <w:lvlJc w:val="left"/>
+      <w:pPr>
+        <w:ind w:left="2880" w:hanging="360"/>
+      </w:pPr>
+      <w:rPr>
+        <w:rFonts w:ascii="Symbol" w:hAnsi="Symbol" w:hint="default"/>
+      </w:rPr>
+    </w:lvl>
+    <w:lvl w:ilvl="4" w:tplc="04090003" w:tentative="1">
+      <w:start w:val="1"/>
+      <w:numFmt w:val="bullet"/>
+      <w:lvlText w:val="o"/>
+      <w:lvlJc w:val="left"/>
+      <w:pPr>
+        <w:ind w:left="3600" w:hanging="360"/>
+      </w:pPr>
+      <w:rPr>
+        <w:rFonts w:ascii="Courier New" w:hAnsi="Courier New" w:cs="Courier New" w:hint="default"/>
+      </w:rPr>
+    </w:lvl>
+    <w:lvl w:ilvl="5" w:tplc="04090005" w:tentative="1">
+      <w:start w:val="1"/>
+      <w:numFmt w:val="bullet"/>
+      <w:lvlText w:val=""/>
+      <w:lvlJc w:val="left"/>
+      <w:pPr>
+        <w:ind w:left="4320" w:hanging="360"/>
+      </w:pPr>
+      <w:rPr>
+        <w:rFonts w:ascii="Wingdings" w:hAnsi="Wingdings" w:hint="default"/>
+      </w:rPr>
+    </w:lvl>
+    <w:lvl w:ilvl="6" w:tplc="04090001" w:tentative="1">
+      <w:start w:val="1"/>
+      <w:numFmt w:val="bullet"/>
+      <w:lvlText w:val=""/>
+      <w:lvlJc w:val="left"/>
+      <w:pPr>
+        <w:ind w:left="5040" w:hanging="360"/>
+      </w:pPr>
+      <w:rPr>
+        <w:rFonts w:ascii="Symbol" w:hAnsi="Symbol" w:hint="default"/>
+      </w:rPr>
+    </w:lvl>
+    <w:lvl w:ilvl="7" w:tplc="04090003" w:tentative="1">
+      <w:start w:val="1"/>
+      <w:numFmt w:val="bullet"/>
+      <w:lvlText w:val="o"/>
+      <w:lvlJc w:val="left"/>
+      <w:pPr>
+        <w:ind w:left="5760" w:hanging="360"/>
+      </w:pPr>
+      <w:rPr>
+        <w:rFonts w:ascii="Courier New" w:hAnsi="Courier New" w:cs="Courier New" w:hint="default"/>
+      </w:rPr>
+    </w:lvl>
+    <w:lvl w:ilvl="8" w:tplc="04090005" w:tentative="1">
+      <w:start w:val="1"/>
+      <w:numFmt w:val="bullet"/>
+      <w:lvlText w:val=""/>
+      <w:lvlJc w:val="left"/>
+      <w:pPr>
+        <w:ind w:left="6480" w:hanging="360"/>
+      </w:pPr>
+      <w:rPr>
+        <w:rFonts w:ascii="Wingdings" w:hAnsi="Wingdings" w:hint="default"/>
+      </w:rPr>
+    </w:lvl>
+  </w:abstractNum>
+  <w:abstractNum w:abstractNumId="14" w15:restartNumberingAfterBreak="0">
     <w:nsid w:val="65E852B7"/>
     <w:multiLevelType w:val="hybridMultilevel"/>
     <w:tmpl w:val="7040B4CA"/>
@@ -3490,7 +3650,7 @@
       </w:rPr>
     </w:lvl>
   </w:abstractNum>
-  <w:abstractNum w:abstractNumId="14" w15:restartNumberingAfterBreak="0">
+  <w:abstractNum w:abstractNumId="15" w15:restartNumberingAfterBreak="0">
     <w:nsid w:val="66452E46"/>
     <w:multiLevelType w:val="hybridMultilevel"/>
     <w:tmpl w:val="F2C29800"/>
@@ -3603,7 +3763,7 @@
       </w:rPr>
     </w:lvl>
   </w:abstractNum>
-  <w:abstractNum w:abstractNumId="15" w15:restartNumberingAfterBreak="0">
+  <w:abstractNum w:abstractNumId="16" w15:restartNumberingAfterBreak="0">
     <w:nsid w:val="6BBE20F4"/>
     <w:multiLevelType w:val="hybridMultilevel"/>
     <w:tmpl w:val="DA660A8C"/>
@@ -3716,7 +3876,7 @@
       </w:rPr>
     </w:lvl>
   </w:abstractNum>
-  <w:abstractNum w:abstractNumId="16" w15:restartNumberingAfterBreak="0">
+  <w:abstractNum w:abstractNumId="17" w15:restartNumberingAfterBreak="0">
     <w:nsid w:val="6E6438AA"/>
     <w:multiLevelType w:val="hybridMultilevel"/>
     <w:tmpl w:val="43465F7E"/>
@@ -3829,7 +3989,7 @@
       </w:rPr>
     </w:lvl>
   </w:abstractNum>
-  <w:abstractNum w:abstractNumId="17" w15:restartNumberingAfterBreak="0">
+  <w:abstractNum w:abstractNumId="18" w15:restartNumberingAfterBreak="0">
     <w:nsid w:val="75D252AF"/>
     <w:multiLevelType w:val="multilevel"/>
     <w:tmpl w:val="9E20AE8E"/>
@@ -3978,7 +4138,7 @@
       </w:rPr>
     </w:lvl>
   </w:abstractNum>
-  <w:abstractNum w:abstractNumId="18" w15:restartNumberingAfterBreak="0">
+  <w:abstractNum w:abstractNumId="19" w15:restartNumberingAfterBreak="0">
     <w:nsid w:val="7F6D4BED"/>
     <w:multiLevelType w:val="multilevel"/>
     <w:tmpl w:val="EB2A4B52"/>
@@ -4128,7 +4288,7 @@
     </w:lvl>
   </w:abstractNum>
   <w:num w:numId="1" w16cid:durableId="117651727">
-    <w:abstractNumId w:val="17"/>
+    <w:abstractNumId w:val="18"/>
   </w:num>
   <w:num w:numId="2" w16cid:durableId="957175016">
     <w:abstractNumId w:val="5"/>
@@ -4140,7 +4300,7 @@
     <w:abstractNumId w:val="9"/>
   </w:num>
   <w:num w:numId="5" w16cid:durableId="2058697030">
-    <w:abstractNumId w:val="18"/>
+    <w:abstractNumId w:val="19"/>
   </w:num>
   <w:num w:numId="6" w16cid:durableId="128013269">
     <w:abstractNumId w:val="0"/>
@@ -4164,10 +4324,10 @@
     <w:abstractNumId w:val="12"/>
   </w:num>
   <w:num w:numId="13" w16cid:durableId="872038189">
-    <w:abstractNumId w:val="16"/>
+    <w:abstractNumId w:val="17"/>
   </w:num>
   <w:num w:numId="14" w16cid:durableId="1318462792">
-    <w:abstractNumId w:val="14"/>
+    <w:abstractNumId w:val="15"/>
   </w:num>
   <w:num w:numId="15" w16cid:durableId="595358158">
     <w:abstractNumId w:val="7"/>
@@ -4179,10 +4339,13 @@
     <w:abstractNumId w:val="11"/>
   </w:num>
   <w:num w:numId="18" w16cid:durableId="1170635503">
-    <w:abstractNumId w:val="13"/>
+    <w:abstractNumId w:val="14"/>
   </w:num>
   <w:num w:numId="19" w16cid:durableId="104278724">
-    <w:abstractNumId w:val="15"/>
+    <w:abstractNumId w:val="16"/>
+  </w:num>
+  <w:num w:numId="20" w16cid:durableId="749040506">
+    <w:abstractNumId w:val="13"/>
   </w:num>
 </w:numbering>
 </file>

</xml_diff>